<commit_message>
Week 2: revise lecture, rebuild Lab02 and HW02 student notebooks July 17 2026
</commit_message>
<xml_diff>
--- a/lectures/week01/Week1_Lecture.docx
+++ b/lectures/week01/Week1_Lecture.docx
@@ -333,7 +333,21 @@
       </w:r>
     </w:p>
     <w:p>
-      <w:r>
+      <w:pPr>
+        <w:pStyle w:val="ListParagraph"/>
+        <w:numPr>
+          <w:ilvl w:val="0"/>
+          <w:numId w:val="2"/>
+        </w:numPr>
+        <w:spacing w:after="100" w:line="300" w:lineRule="auto"/>
+      </w:pPr>
+      <w:r>
+        <w:t>Yoshikawa, T. (1985). Manipulability of robotic mechanisms. The International Journal of Robotics Research, 4(2), 3-9.</w:t>
+      </w:r>
+    </w:p>
+    <w:p>
+      <w:r>
+        <w:lastRenderedPageBreak/>
         <w:br w:type="page"/>
       </w:r>
     </w:p>
@@ -1575,13 +1589,7 @@
       </w:r>
       <w:proofErr w:type="gramStart"/>
       <w:r>
-        <w:t>1]</w:t>
-      </w:r>
-      <w:r>
-        <w:t>ᵀ</w:t>
-      </w:r>
-      <w:r>
-        <w:t>.</w:t>
+        <w:t>1]ᵀ.</w:t>
       </w:r>
       <w:proofErr w:type="gramEnd"/>
       <w:r>
@@ -2273,10 +2281,7 @@
               <w:t>invert</w:t>
             </w:r>
             <w:r>
-              <w:t xml:space="preserve"> every time you reach for an object. The target is specified in a visual/gaze-referenced frame, while the motor command must ultimately be issued in joint coordinates. The precise coordinate system of the visual representation is itself debated — retinal coding is angular, and some evidence (Soechting &amp; Flanders, 1989) favors a spherical distance/azimuth/elevation representation rather than a Cartesian one. Regardless of the exact frames, the map from visual target to joint command is nonlinear, which is wh</w:t>
-            </w:r>
-            <w:r>
-              <w:t>at makes the inversion nontrivial. (In our simulation we adopt Cartesian task coordinates (x, y) as a modeling convenience.)</w:t>
+              <w:t xml:space="preserve"> every time you reach for an object. The target is specified in a visual/gaze-referenced frame, while the motor command must ultimately be issued in joint coordinates. The precise coordinate system of the visual representation is itself debated — retinal coding is angular, and some evidence (Soechting &amp; Flanders, 1989) favors a spherical distance/azimuth/elevation representation rather than a Cartesian one. Regardless of the exact frames, the map from visual target to joint command is nonlinear, which is what makes the inversion nontrivial. (In our simulation we adopt Cartesian task coordinates (x, y) as a modeling convenience.)</w:t>
             </w:r>
           </w:p>
         </w:tc>
@@ -2368,19 +2373,7 @@
         <w:rPr>
           <w:vertAlign w:val="subscript"/>
         </w:rPr>
-        <w:t>ₘ</w:t>
-      </w:r>
-      <w:r>
-        <w:rPr>
-          <w:vertAlign w:val="subscript"/>
-        </w:rPr>
-        <w:t>ᵢ</w:t>
-      </w:r>
-      <w:r>
-        <w:rPr>
-          <w:vertAlign w:val="subscript"/>
-        </w:rPr>
-        <w:t>ₙ</w:t>
+        <w:t>ₘᵢₙ</w:t>
       </w:r>
       <w:r>
         <w:t xml:space="preserve"> = </w:t>
@@ -3093,10 +3086,7 @@
               <w:spacing w:after="160" w:line="300" w:lineRule="auto"/>
             </w:pPr>
             <w:r>
-              <w:t>These are not new physical quantities but abbreviations for the coefficients that appear when the forward-kinematic equations are regrouped by cos(θ₁) and sin(θ₁) (Equations 3.7a–b). Because θ₂ is already known at this stage, both are constants. Geometrically, (k₁, k₂) is the hand position expressed in a frame aligned with the upper arm: k₁ is the component along the upper-arm axis and k₂ the component perpendicular to it. Two useful checks follow — their magnitude recovers the shoulder-to-hand distance, k₁</w:t>
-            </w:r>
-            <w:r>
-              <w:t>² + k₂² = r², and atan2(k₂, k₁) is the angular offset between the upper arm and the shoulder-to-hand line, which is exactly the quantity subtracted in Equation 3.8.</w:t>
+              <w:t>These are not new physical quantities but abbreviations for the coefficients that appear when the forward-kinematic equations are regrouped by cos(θ₁) and sin(θ₁) (Equations 3.7a–b). Because θ₂ is already known at this stage, both are constants. Geometrically, (k₁, k₂) is the hand position expressed in a frame aligned with the upper arm: k₁ is the component along the upper-arm axis and k₂ the component perpendicular to it. Two useful checks follow — their magnitude recovers the shoulder-to-hand distance, k₁² + k₂² = r², and atan2(k₂, k₁) is the angular offset between the upper arm and the shoulder-to-hand line, which is exactly the quantity subtracted in Equation 3.8.</w:t>
             </w:r>
           </w:p>
         </w:tc>
@@ -3430,17 +3420,7 @@
           <w:sz w:val="20"/>
           <w:szCs w:val="20"/>
         </w:rPr>
-        <w:t>Figure 5. Inverse kinematics as circle intersection, shown for three targets along a fixed direction (50°). (a) Interior target (r &lt; l₁ + l₂): the circles cross at two points, giving the valid elbow-flexion solution (blue, θ₂ = +60°) and the invalid hyperextension solution (red, θ₂ = −60°). (b) Target on the outer workspace boundary (r = l₁ + l₂ = 0.80 m): the circles are tangent, the two solutions merge into one, and the arm is fully extended (θ₂ = 0°) — precisely the configuration where det(J) = 0 (Sectio</w:t>
-      </w:r>
-      <w:r>
-        <w:rPr>
-          <w:i/>
-          <w:iCs/>
-          <w:color w:val="666666"/>
-          <w:sz w:val="20"/>
-          <w:szCs w:val="20"/>
-        </w:rPr>
-        <w:t>n 4). (c) Target beyond the boundary (r &gt; l₁ + l₂): the circles do not intersect and the target is unreachable.</w:t>
+        <w:t>Figure 5. Inverse kinematics as circle intersection, shown for three targets along a fixed direction (50°). (a) Interior target (r &lt; l₁ + l₂): the circles cross at two points, giving the valid elbow-flexion solution (blue, θ₂ = +60°) and the invalid hyperextension solution (red, θ₂ = −60°). (b) Target on the outer workspace boundary (r = l₁ + l₂ = 0.80 m): the circles are tangent, the two solutions merge into one, and the arm is fully extended (θ₂ = 0°) — precisely the configuration where det(J) = 0 (Section 4). (c) Target beyond the boundary (r &gt; l₁ + l₂): the circles do not intersect and the target is unreachable.</w:t>
       </w:r>
     </w:p>
     <w:p>
@@ -3664,25 +3644,7 @@
           <w:sz w:val="24"/>
           <w:szCs w:val="24"/>
         </w:rPr>
-        <w:t xml:space="preserve">    equivalently:    </w:t>
-      </w:r>
-      <w:r>
-        <w:rPr>
-          <w:rFonts w:ascii="Cambria Math" w:eastAsia="Cambria Math" w:hAnsi="Cambria Math" w:cs="Cambria Math"/>
-          <w:color w:val="1B2A4A"/>
-          <w:sz w:val="24"/>
-          <w:szCs w:val="24"/>
-        </w:rPr>
-        <w:t>ṗ</w:t>
-      </w:r>
-      <w:r>
-        <w:rPr>
-          <w:rFonts w:ascii="Cambria Math" w:eastAsia="Cambria Math" w:hAnsi="Cambria Math" w:cs="Cambria Math"/>
-          <w:color w:val="1B2A4A"/>
-          <w:sz w:val="24"/>
-          <w:szCs w:val="24"/>
-        </w:rPr>
-        <w:t xml:space="preserve"> = J · θ̇</w:t>
+        <w:t xml:space="preserve">    equivalently:    ṗ = J · θ̇</w:t>
       </w:r>
       <w:r>
         <w:rPr>
@@ -3699,13 +3661,7 @@
         <w:spacing w:after="160" w:line="300" w:lineRule="auto"/>
       </w:pPr>
       <w:r>
-        <w:t xml:space="preserve">where </w:t>
-      </w:r>
-      <w:r>
-        <w:t>ṗ</w:t>
-      </w:r>
-      <w:r>
-        <w:t xml:space="preserve"> = (ẋ, ẏ) is the endpoint velocity and θ̇ = (θ̇₁, θ̇₂) is the joint angular velocity vector.</w:t>
+        <w:t>where ṗ = (ẋ, ẏ) is the endpoint velocity and θ̇ = (θ̇₁, θ̇₂) is the joint angular velocity vector.</w:t>
       </w:r>
     </w:p>
     <w:p>
@@ -4845,16 +4801,7 @@
           <w:sz w:val="24"/>
           <w:szCs w:val="24"/>
         </w:rPr>
-        <w:t>ṗ</w:t>
-      </w:r>
-      <w:r>
-        <w:rPr>
-          <w:rFonts w:ascii="Cambria Math" w:eastAsia="Cambria Math" w:hAnsi="Cambria Math" w:cs="Cambria Math"/>
-          <w:color w:val="1B2A4A"/>
-          <w:sz w:val="24"/>
-          <w:szCs w:val="24"/>
-        </w:rPr>
-        <w:t xml:space="preserve"> = J(q) · </w:t>
+        <w:t xml:space="preserve">ṗ = J(q) · </w:t>
       </w:r>
       <m:oMath>
         <m:acc>
@@ -5195,13 +5142,7 @@
         <w:spacing w:after="160" w:line="300" w:lineRule="auto"/>
       </w:pPr>
       <w:r>
-        <w:t xml:space="preserve">This defines a unit circle in joint-velocity space. Under the linear mapping </w:t>
-      </w:r>
-      <w:r>
-        <w:t>ṗ</w:t>
-      </w:r>
-      <w:r>
-        <w:t xml:space="preserve"> = </w:t>
+        <w:t xml:space="preserve">This defines a unit circle in joint-velocity space. Under the linear mapping ṗ = </w:t>
       </w:r>
       <w:proofErr w:type="spellStart"/>
       <w:r>
@@ -5209,16 +5150,7 @@
       </w:r>
       <w:proofErr w:type="spellEnd"/>
       <w:r>
-        <w:t>̇</w:t>
-      </w:r>
-      <w:r>
-        <w:t>, this circle maps to an ellipse in endpoint-velocity space. To characterize this ellipse, substitute θ̇ = J⁻¹</w:t>
-      </w:r>
-      <w:r>
-        <w:t>ṗ</w:t>
-      </w:r>
-      <w:r>
-        <w:t xml:space="preserve"> into the unit-norm constraint:</w:t>
+        <w:t>̇, this circle maps to an ellipse in endpoint-velocity space. To characterize this ellipse, substitute θ̇ = J⁻¹ṗ into the unit-norm constraint:</w:t>
       </w:r>
     </w:p>
     <w:p>
@@ -5247,25 +5179,7 @@
           <w:sz w:val="24"/>
           <w:szCs w:val="24"/>
         </w:rPr>
-        <w:t>ṗ</w:t>
-      </w:r>
-      <w:r>
-        <w:rPr>
-          <w:rFonts w:ascii="Cambria Math" w:eastAsia="Cambria Math" w:hAnsi="Cambria Math" w:cs="Cambria Math"/>
-          <w:color w:val="1B2A4A"/>
-          <w:sz w:val="24"/>
-          <w:szCs w:val="24"/>
-        </w:rPr>
-        <w:t>)</w:t>
-      </w:r>
-      <w:r>
-        <w:rPr>
-          <w:rFonts w:ascii="Cambria Math" w:eastAsia="Cambria Math" w:hAnsi="Cambria Math" w:cs="Cambria Math"/>
-          <w:color w:val="1B2A4A"/>
-          <w:sz w:val="24"/>
-          <w:szCs w:val="24"/>
-        </w:rPr>
-        <w:t>ᵀ</w:t>
+        <w:t>ṗ)ᵀ</w:t>
       </w:r>
       <w:proofErr w:type="gramEnd"/>
       <w:r>
@@ -5275,25 +5189,7 @@
           <w:sz w:val="24"/>
           <w:szCs w:val="24"/>
         </w:rPr>
-        <w:t>(J⁻¹</w:t>
-      </w:r>
-      <w:r>
-        <w:rPr>
-          <w:rFonts w:ascii="Cambria Math" w:eastAsia="Cambria Math" w:hAnsi="Cambria Math" w:cs="Cambria Math"/>
-          <w:color w:val="1B2A4A"/>
-          <w:sz w:val="24"/>
-          <w:szCs w:val="24"/>
-        </w:rPr>
-        <w:t>ṗ</w:t>
-      </w:r>
-      <w:r>
-        <w:rPr>
-          <w:rFonts w:ascii="Cambria Math" w:eastAsia="Cambria Math" w:hAnsi="Cambria Math" w:cs="Cambria Math"/>
-          <w:color w:val="1B2A4A"/>
-          <w:sz w:val="24"/>
-          <w:szCs w:val="24"/>
-        </w:rPr>
-        <w:t>) = 1</w:t>
+        <w:t>(J⁻¹ṗ) = 1</w:t>
       </w:r>
       <w:r>
         <w:rPr>
@@ -5321,61 +5217,7 @@
           <w:sz w:val="24"/>
           <w:szCs w:val="24"/>
         </w:rPr>
-        <w:t>ṗ</w:t>
-      </w:r>
-      <w:r>
-        <w:rPr>
-          <w:rFonts w:ascii="Cambria Math" w:eastAsia="Cambria Math" w:hAnsi="Cambria Math" w:cs="Cambria Math"/>
-          <w:color w:val="1B2A4A"/>
-          <w:sz w:val="24"/>
-          <w:szCs w:val="24"/>
-        </w:rPr>
-        <w:t>ᵀ</w:t>
-      </w:r>
-      <w:r>
-        <w:rPr>
-          <w:rFonts w:ascii="Cambria Math" w:eastAsia="Cambria Math" w:hAnsi="Cambria Math" w:cs="Cambria Math"/>
-          <w:color w:val="1B2A4A"/>
-          <w:sz w:val="24"/>
-          <w:szCs w:val="24"/>
-        </w:rPr>
-        <w:t xml:space="preserve"> (J⁻</w:t>
-      </w:r>
-      <w:r>
-        <w:rPr>
-          <w:rFonts w:ascii="Cambria Math" w:eastAsia="Cambria Math" w:hAnsi="Cambria Math" w:cs="Cambria Math"/>
-          <w:color w:val="1B2A4A"/>
-          <w:sz w:val="24"/>
-          <w:szCs w:val="24"/>
-        </w:rPr>
-        <w:t>ᵀ</w:t>
-      </w:r>
-      <w:r>
-        <w:rPr>
-          <w:rFonts w:ascii="Cambria Math" w:eastAsia="Cambria Math" w:hAnsi="Cambria Math" w:cs="Cambria Math"/>
-          <w:color w:val="1B2A4A"/>
-          <w:sz w:val="24"/>
-          <w:szCs w:val="24"/>
-        </w:rPr>
-        <w:t xml:space="preserve"> J⁻¹) </w:t>
-      </w:r>
-      <w:r>
-        <w:rPr>
-          <w:rFonts w:ascii="Cambria Math" w:eastAsia="Cambria Math" w:hAnsi="Cambria Math" w:cs="Cambria Math"/>
-          <w:color w:val="1B2A4A"/>
-          <w:sz w:val="24"/>
-          <w:szCs w:val="24"/>
-        </w:rPr>
-        <w:t>ṗ</w:t>
-      </w:r>
-      <w:r>
-        <w:rPr>
-          <w:rFonts w:ascii="Cambria Math" w:eastAsia="Cambria Math" w:hAnsi="Cambria Math" w:cs="Cambria Math"/>
-          <w:color w:val="1B2A4A"/>
-          <w:sz w:val="24"/>
-          <w:szCs w:val="24"/>
-        </w:rPr>
-        <w:t xml:space="preserve"> = 1</w:t>
+        <w:t>ṗᵀ (J⁻ᵀ J⁻¹) ṗ = 1</w:t>
       </w:r>
       <w:r>
         <w:rPr>
@@ -5403,61 +5245,7 @@
           <w:sz w:val="24"/>
           <w:szCs w:val="24"/>
         </w:rPr>
-        <w:t>ṗ</w:t>
-      </w:r>
-      <w:r>
-        <w:rPr>
-          <w:rFonts w:ascii="Cambria Math" w:eastAsia="Cambria Math" w:hAnsi="Cambria Math" w:cs="Cambria Math"/>
-          <w:color w:val="1B2A4A"/>
-          <w:sz w:val="24"/>
-          <w:szCs w:val="24"/>
-        </w:rPr>
-        <w:t>ᵀ</w:t>
-      </w:r>
-      <w:r>
-        <w:rPr>
-          <w:rFonts w:ascii="Cambria Math" w:eastAsia="Cambria Math" w:hAnsi="Cambria Math" w:cs="Cambria Math"/>
-          <w:color w:val="1B2A4A"/>
-          <w:sz w:val="24"/>
-          <w:szCs w:val="24"/>
-        </w:rPr>
-        <w:t xml:space="preserve"> (JJ</w:t>
-      </w:r>
-      <w:r>
-        <w:rPr>
-          <w:rFonts w:ascii="Cambria Math" w:eastAsia="Cambria Math" w:hAnsi="Cambria Math" w:cs="Cambria Math"/>
-          <w:color w:val="1B2A4A"/>
-          <w:sz w:val="24"/>
-          <w:szCs w:val="24"/>
-        </w:rPr>
-        <w:t>ᵀ</w:t>
-      </w:r>
-      <w:r>
-        <w:rPr>
-          <w:rFonts w:ascii="Cambria Math" w:eastAsia="Cambria Math" w:hAnsi="Cambria Math" w:cs="Cambria Math"/>
-          <w:color w:val="1B2A4A"/>
-          <w:sz w:val="24"/>
-          <w:szCs w:val="24"/>
-        </w:rPr>
-        <w:t xml:space="preserve">)⁻¹ </w:t>
-      </w:r>
-      <w:r>
-        <w:rPr>
-          <w:rFonts w:ascii="Cambria Math" w:eastAsia="Cambria Math" w:hAnsi="Cambria Math" w:cs="Cambria Math"/>
-          <w:color w:val="1B2A4A"/>
-          <w:sz w:val="24"/>
-          <w:szCs w:val="24"/>
-        </w:rPr>
-        <w:t>ṗ</w:t>
-      </w:r>
-      <w:r>
-        <w:rPr>
-          <w:rFonts w:ascii="Cambria Math" w:eastAsia="Cambria Math" w:hAnsi="Cambria Math" w:cs="Cambria Math"/>
-          <w:color w:val="1B2A4A"/>
-          <w:sz w:val="24"/>
-          <w:szCs w:val="24"/>
-        </w:rPr>
-        <w:t xml:space="preserve"> = 1</w:t>
+        <w:t>ṗᵀ (JJᵀ)⁻¹ ṗ = 1</w:t>
       </w:r>
       <w:r>
         <w:rPr>
@@ -5481,14 +5269,7 @@
           <w:b/>
           <w:bCs/>
         </w:rPr>
-        <w:t>A = JJ</w:t>
-      </w:r>
-      <w:r>
-        <w:rPr>
-          <w:b/>
-          <w:bCs/>
-        </w:rPr>
-        <w:t>ᵀ</w:t>
+        <w:t>A = JJᵀ</w:t>
       </w:r>
       <w:r>
         <w:t xml:space="preserve"> defines the ellipsoid. Its eigenvectors give the principal axes of the ellipse, and its eigenvalues give the squared semi-axis lengths.</w:t>
@@ -5521,13 +5302,7 @@
         <w:rPr>
           <w:rFonts w:ascii="Cambria Math" w:eastAsia="Cambria Math" w:hAnsi="Cambria Math" w:cs="Cambria Math"/>
         </w:rPr>
-        <w:t>A = JJ</w:t>
-      </w:r>
-      <w:r>
-        <w:rPr>
-          <w:rFonts w:ascii="Cambria Math" w:eastAsia="Cambria Math" w:hAnsi="Cambria Math" w:cs="Cambria Math"/>
-        </w:rPr>
-        <w:t>ᵀ</w:t>
+        <w:t>A = JJᵀ</w:t>
       </w:r>
       <w:r>
         <w:t>. Since A is a 2×2 symmetric positive semi-definite matrix, it has two real non-negative eigenvalues λ₁ ≥ λ₂ ≥ 0. The interpretation:</w:t>
@@ -5681,16 +5456,7 @@
           <w:sz w:val="24"/>
           <w:szCs w:val="24"/>
         </w:rPr>
-        <w:t>(JJ</w:t>
-      </w:r>
-      <w:r>
-        <w:rPr>
-          <w:rFonts w:ascii="Cambria Math" w:eastAsia="Cambria Math" w:hAnsi="Cambria Math" w:cs="Cambria Math"/>
-          <w:color w:val="1B2A4A"/>
-          <w:sz w:val="24"/>
-          <w:szCs w:val="24"/>
-        </w:rPr>
-        <w:t>ᵀ</w:t>
+        <w:t>(JJᵀ</w:t>
       </w:r>
       <w:proofErr w:type="gramStart"/>
       <w:r>
@@ -5747,13 +5513,7 @@
       </w:r>
       <w:proofErr w:type="gramEnd"/>
       <w:r>
-        <w:t>JJ</w:t>
-      </w:r>
-      <w:r>
-        <w:t>ᵀ</w:t>
-      </w:r>
-      <w:r>
-        <w:t xml:space="preserve">) = </w:t>
+        <w:t xml:space="preserve">JJᵀ) = </w:t>
       </w:r>
       <w:proofErr w:type="spellStart"/>
       <w:r>
@@ -6367,13 +6127,7 @@
         <w:rPr>
           <w:rFonts w:ascii="Cambria Math" w:eastAsia="Cambria Math" w:hAnsi="Cambria Math" w:cs="Cambria Math"/>
         </w:rPr>
-        <w:t>ṗ</w:t>
-      </w:r>
-      <w:r>
-        <w:rPr>
-          <w:rFonts w:ascii="Cambria Math" w:eastAsia="Cambria Math" w:hAnsi="Cambria Math" w:cs="Cambria Math"/>
-        </w:rPr>
-        <w:t xml:space="preserve"> = J</w:t>
+        <w:t>ṗ = J</w:t>
       </w:r>
       <m:oMath>
         <m:acc>
@@ -6407,13 +6161,7 @@
         <w:t>underdetermined</w:t>
       </w:r>
       <w:r>
-        <w:t xml:space="preserve">: infinitely many joint velocity vectors θ̇ can produce the same endpoint velocity </w:t>
-      </w:r>
-      <w:r>
-        <w:t>ṗ</w:t>
-      </w:r>
-      <w:r>
-        <w:t>. Mathematically, the null space of J is non-empty:</w:t>
+        <w:t>: infinitely many joint velocity vectors θ̇ can produce the same endpoint velocity ṗ. Mathematically, the null space of J is non-empty:</w:t>
       </w:r>
     </w:p>
     <w:p>
@@ -6599,17 +6347,7 @@
           <w:sz w:val="20"/>
           <w:szCs w:val="20"/>
         </w:rPr>
-        <w:t>Figure 9. Kinematic redundancy under anatomical joint limits. Left: our non-redundant 2-DOF arm — the elbow-up solution (blue) is the only valid posture, while the elbow-down solution (grey, dashed) requires hyperextension (θ₂ &lt; 0) and is rejected by the joint limits. Right: a redundant 3-DOF arm subject to the same limits reaches the same target through a continuous but bounded family of postures (self-motion through the null space of J). Redundancy persists under constraints; our 2-link model simply never</w:t>
-      </w:r>
-      <w:r>
-        <w:rPr>
-          <w:i/>
-          <w:iCs/>
-          <w:color w:val="666666"/>
-          <w:sz w:val="20"/>
-          <w:szCs w:val="20"/>
-        </w:rPr>
-        <w:t xml:space="preserve"> has it.</w:t>
+        <w:t>Figure 9. Kinematic redundancy under anatomical joint limits. Left: our non-redundant 2-DOF arm — the elbow-up solution (blue) is the only valid posture, while the elbow-down solution (grey, dashed) requires hyperextension (θ₂ &lt; 0) and is rejected by the joint limits. Right: a redundant 3-DOF arm subject to the same limits reaches the same target through a continuous but bounded family of postures (self-motion through the null space of J). Redundancy persists under constraints; our 2-link model simply never has it.</w:t>
       </w:r>
     </w:p>
     <w:p>
@@ -6657,10 +6395,7 @@
       </w:r>
       <w:proofErr w:type="spellStart"/>
       <w:r>
-        <w:t>J⁺</w:t>
-      </w:r>
-      <w:r>
-        <w:t>ṗ</w:t>
+        <w:t>J⁺ṗ</w:t>
       </w:r>
       <w:proofErr w:type="spellEnd"/>
       <w:r>
@@ -6668,23 +6403,11 @@
       </w:r>
       <w:proofErr w:type="gramStart"/>
       <w:r>
-        <w:t>J</w:t>
-      </w:r>
-      <w:r>
-        <w:t>ᵀ</w:t>
-      </w:r>
-      <w:r>
-        <w:t>(</w:t>
+        <w:t>Jᵀ(</w:t>
       </w:r>
       <w:proofErr w:type="gramEnd"/>
       <w:r>
-        <w:t>JJ</w:t>
-      </w:r>
-      <w:r>
-        <w:t>ᵀ</w:t>
-      </w:r>
-      <w:r>
-        <w:t>)⁻¹ is the Moore–Penrose pseudoinverse. This minimizes instantaneous joint speed but has no physiological justification.</w:t>
+        <w:t>JJᵀ)⁻¹ is the Moore–Penrose pseudoinverse. This minimizes instantaneous joint speed but has no physiological justification.</w:t>
       </w:r>
     </w:p>
     <w:p>

</xml_diff>

<commit_message>
Week 1 after modification of k1,k2
</commit_message>
<xml_diff>
--- a/lectures/week01/Week1_Lecture.docx
+++ b/lectures/week01/Week1_Lecture.docx
@@ -263,13 +263,8 @@
         </w:numPr>
         <w:spacing w:after="100" w:line="300" w:lineRule="auto"/>
       </w:pPr>
-      <w:proofErr w:type="spellStart"/>
-      <w:r>
-        <w:t>Morasso</w:t>
-      </w:r>
-      <w:proofErr w:type="spellEnd"/>
-      <w:r>
-        <w:t xml:space="preserve">, P. (1981). Spatial control of arm movements. </w:t>
+      <w:r>
+        <w:t xml:space="preserve">Morasso, P. (1981). Spatial control of arm movements. </w:t>
       </w:r>
       <w:r>
         <w:rPr>
@@ -343,8 +338,6 @@
       </w:pPr>
       <w:r>
         <w:t>Yoshikawa, T. (1985). Manipulability of robotic mechanisms. The International Journal of Robotics Research, 4(2), 3-9.</w:t>
-      </w:r>
-      <w:r>
         <w:br w:type="page"/>
       </w:r>
     </w:p>
@@ -421,15 +414,7 @@
         <w:t>2-joint planar arm</w:t>
       </w:r>
       <w:r>
-        <w:t xml:space="preserve"> representing the human shoulder and elbow, constrained to move in the horizontal plane. This eliminates gravity from the equations of motion, allowing us to isolate the control-relevant dynamics: interaction torques, muscle forces, and nonlinear coordinate transforms. This is the same paradigm used by Gribble et al. (1998), </w:t>
-      </w:r>
-      <w:proofErr w:type="spellStart"/>
-      <w:r>
-        <w:t>Shadmehr</w:t>
-      </w:r>
-      <w:proofErr w:type="spellEnd"/>
-      <w:r>
-        <w:t xml:space="preserve"> &amp; Mussa-Ivaldi (1994), and most of the empirical literature we will study.</w:t>
+        <w:t xml:space="preserve"> representing the human shoulder and elbow, constrained to move in the horizontal plane. This eliminates gravity from the equations of motion, allowing us to isolate the control-relevant dynamics: interaction torques, muscle forces, and nonlinear coordinate transforms. This is the same paradigm used by Gribble et al. (1998), Shadmehr &amp; Mussa-Ivaldi (1994), and most of the empirical literature we will study.</w:t>
       </w:r>
     </w:p>
     <w:p>
@@ -439,13 +424,8 @@
           <w:bottom w:val="single" w:sz="2" w:space="4" w:color="2E86AB"/>
         </w:pBdr>
       </w:pPr>
-      <w:proofErr w:type="gramStart"/>
-      <w:r>
-        <w:t>1.1  Defining</w:t>
-      </w:r>
-      <w:proofErr w:type="gramEnd"/>
-      <w:r>
-        <w:t xml:space="preserve"> the Model</w:t>
+      <w:r>
+        <w:t xml:space="preserve">1.1  Defining the Model</w:t>
       </w:r>
     </w:p>
     <w:p>
@@ -978,37 +958,12 @@
             <w:r>
               <w:t xml:space="preserve">, covered in Section 3. In robotics, a general method called the </w:t>
             </w:r>
-            <w:proofErr w:type="spellStart"/>
             <w:r>
               <w:rPr>
                 <w:b/>
                 <w:bCs/>
               </w:rPr>
-              <w:t>Denavit</w:t>
-            </w:r>
-            <w:proofErr w:type="spellEnd"/>
-            <w:r>
-              <w:rPr>
-                <w:b/>
-                <w:bCs/>
-              </w:rPr>
-              <w:t>–</w:t>
-            </w:r>
-            <w:proofErr w:type="spellStart"/>
-            <w:r>
-              <w:rPr>
-                <w:b/>
-                <w:bCs/>
-              </w:rPr>
-              <w:t>Hartenberg</w:t>
-            </w:r>
-            <w:proofErr w:type="spellEnd"/>
-            <w:r>
-              <w:rPr>
-                <w:b/>
-                <w:bCs/>
-              </w:rPr>
-              <w:t xml:space="preserve"> (DH) convention</w:t>
+              <w:t xml:space="preserve">Denavit–Hartenberg (DH) convention</w:t>
             </w:r>
             <w:r>
               <w:t xml:space="preserve"> systematically attaches coordinate frames to each link of a chain to derive FK for arbitrarily complex manipulators. Our 2-link planar arm is simple enough that basic trigonometry suffices, so DH parameters will not appear in this course.</w:t>
@@ -1090,13 +1045,8 @@
           <w:bottom w:val="single" w:sz="2" w:space="4" w:color="2E86AB"/>
         </w:pBdr>
       </w:pPr>
-      <w:proofErr w:type="gramStart"/>
-      <w:r>
-        <w:t>2.1  Geometric</w:t>
-      </w:r>
-      <w:proofErr w:type="gramEnd"/>
-      <w:r>
-        <w:t xml:space="preserve"> Derivation</w:t>
+      <w:r>
+        <w:t xml:space="preserve">2.1  Geometric Derivation</w:t>
       </w:r>
     </w:p>
     <w:p>
@@ -1187,27 +1137,7 @@
           <w:sz w:val="24"/>
           <w:szCs w:val="24"/>
         </w:rPr>
-        <w:t xml:space="preserve">x = l₁ cos(θ₁) + l₂ </w:t>
-      </w:r>
-      <w:proofErr w:type="gramStart"/>
-      <w:r>
-        <w:rPr>
-          <w:rFonts w:ascii="Cambria Math" w:eastAsia="Cambria Math" w:hAnsi="Cambria Math" w:cs="Cambria Math"/>
-          <w:color w:val="1B2A4A"/>
-          <w:sz w:val="24"/>
-          <w:szCs w:val="24"/>
-        </w:rPr>
-        <w:t>cos(</w:t>
-      </w:r>
-      <w:proofErr w:type="gramEnd"/>
-      <w:r>
-        <w:rPr>
-          <w:rFonts w:ascii="Cambria Math" w:eastAsia="Cambria Math" w:hAnsi="Cambria Math" w:cs="Cambria Math"/>
-          <w:color w:val="1B2A4A"/>
-          <w:sz w:val="24"/>
-          <w:szCs w:val="24"/>
-        </w:rPr>
-        <w:t>θ₁ + θ₂)</w:t>
+        <w:t xml:space="preserve">x = l₁ cos(θ₁) + l₂ cos(θ₁ + θ₂)</w:t>
       </w:r>
       <w:r>
         <w:rPr>
@@ -1235,27 +1165,7 @@
           <w:sz w:val="24"/>
           <w:szCs w:val="24"/>
         </w:rPr>
-        <w:t xml:space="preserve">y = l₁ sin(θ₁) + l₂ </w:t>
-      </w:r>
-      <w:proofErr w:type="gramStart"/>
-      <w:r>
-        <w:rPr>
-          <w:rFonts w:ascii="Cambria Math" w:eastAsia="Cambria Math" w:hAnsi="Cambria Math" w:cs="Cambria Math"/>
-          <w:color w:val="1B2A4A"/>
-          <w:sz w:val="24"/>
-          <w:szCs w:val="24"/>
-        </w:rPr>
-        <w:t>sin(</w:t>
-      </w:r>
-      <w:proofErr w:type="gramEnd"/>
-      <w:r>
-        <w:rPr>
-          <w:rFonts w:ascii="Cambria Math" w:eastAsia="Cambria Math" w:hAnsi="Cambria Math" w:cs="Cambria Math"/>
-          <w:color w:val="1B2A4A"/>
-          <w:sz w:val="24"/>
-          <w:szCs w:val="24"/>
-        </w:rPr>
-        <w:t>θ₁ + θ₂)</w:t>
+        <w:t xml:space="preserve">y = l₁ sin(θ₁) + l₂ sin(θ₁ + θ₂)</w:t>
       </w:r>
       <w:r>
         <w:rPr>
@@ -1321,19 +1231,11 @@
       <w:r>
         <w:t xml:space="preserve">where </w:t>
       </w:r>
-      <w:proofErr w:type="gramStart"/>
       <w:r>
         <w:rPr>
           <w:rFonts w:ascii="Cambria Math" w:eastAsia="Cambria Math" w:hAnsi="Cambria Math" w:cs="Cambria Math"/>
         </w:rPr>
-        <w:t>f :</w:t>
-      </w:r>
-      <w:proofErr w:type="gramEnd"/>
-      <w:r>
-        <w:rPr>
-          <w:rFonts w:ascii="Cambria Math" w:eastAsia="Cambria Math" w:hAnsi="Cambria Math" w:cs="Cambria Math"/>
-        </w:rPr>
-        <w:t xml:space="preserve"> ℝ² → ℝ²</w:t>
+        <w:t xml:space="preserve">f : ℝ² → ℝ²</w:t>
       </w:r>
       <w:r>
         <w:t xml:space="preserve"> is in general a nonlinear function. This nonlinearity is a fundamental source of complexity in motor control.</w:t>
@@ -1346,13 +1248,8 @@
           <w:bottom w:val="single" w:sz="2" w:space="4" w:color="2E86AB"/>
         </w:pBdr>
       </w:pPr>
-      <w:proofErr w:type="gramStart"/>
-      <w:r>
-        <w:t>2.2  Rotation</w:t>
-      </w:r>
-      <w:proofErr w:type="gramEnd"/>
-      <w:r>
-        <w:t xml:space="preserve"> Matrix Derivation</w:t>
+      <w:r>
+        <w:t xml:space="preserve">2.2  Rotation Matrix Derivation</w:t>
       </w:r>
     </w:p>
     <w:p>
@@ -1443,130 +1340,8 @@
           <w:sz w:val="24"/>
           <w:szCs w:val="24"/>
         </w:rPr>
-        <w:t xml:space="preserve">R(θ) = [ </w:t>
-      </w:r>
-      <w:proofErr w:type="spellStart"/>
-      <w:r>
-        <w:rPr>
-          <w:rFonts w:ascii="Cambria Math" w:eastAsia="Cambria Math" w:hAnsi="Cambria Math" w:cs="Cambria Math"/>
-          <w:color w:val="1B2A4A"/>
-          <w:sz w:val="24"/>
-          <w:szCs w:val="24"/>
-        </w:rPr>
-        <w:t>cos</w:t>
-      </w:r>
-      <w:proofErr w:type="gramStart"/>
-      <w:r>
-        <w:rPr>
-          <w:rFonts w:ascii="Cambria Math" w:eastAsia="Cambria Math" w:hAnsi="Cambria Math" w:cs="Cambria Math"/>
-          <w:color w:val="1B2A4A"/>
-          <w:sz w:val="24"/>
-          <w:szCs w:val="24"/>
-        </w:rPr>
-        <w:t>θ</w:t>
-      </w:r>
-      <w:proofErr w:type="spellEnd"/>
-      <w:r>
-        <w:rPr>
-          <w:rFonts w:ascii="Cambria Math" w:eastAsia="Cambria Math" w:hAnsi="Cambria Math" w:cs="Cambria Math"/>
-          <w:color w:val="1B2A4A"/>
-          <w:sz w:val="24"/>
-          <w:szCs w:val="24"/>
-        </w:rPr>
-        <w:t xml:space="preserve">  −</w:t>
-      </w:r>
-      <w:proofErr w:type="spellStart"/>
-      <w:proofErr w:type="gramEnd"/>
-      <w:r>
-        <w:rPr>
-          <w:rFonts w:ascii="Cambria Math" w:eastAsia="Cambria Math" w:hAnsi="Cambria Math" w:cs="Cambria Math"/>
-          <w:color w:val="1B2A4A"/>
-          <w:sz w:val="24"/>
-          <w:szCs w:val="24"/>
-        </w:rPr>
-        <w:t>sin</w:t>
-      </w:r>
-      <w:proofErr w:type="gramStart"/>
-      <w:r>
-        <w:rPr>
-          <w:rFonts w:ascii="Cambria Math" w:eastAsia="Cambria Math" w:hAnsi="Cambria Math" w:cs="Cambria Math"/>
-          <w:color w:val="1B2A4A"/>
-          <w:sz w:val="24"/>
-          <w:szCs w:val="24"/>
-        </w:rPr>
-        <w:t>θ</w:t>
-      </w:r>
-      <w:proofErr w:type="spellEnd"/>
-      <w:r>
-        <w:rPr>
-          <w:rFonts w:ascii="Cambria Math" w:eastAsia="Cambria Math" w:hAnsi="Cambria Math" w:cs="Cambria Math"/>
-          <w:color w:val="1B2A4A"/>
-          <w:sz w:val="24"/>
-          <w:szCs w:val="24"/>
-        </w:rPr>
-        <w:t xml:space="preserve"> ;</w:t>
-      </w:r>
-      <w:proofErr w:type="gramEnd"/>
-      <w:r>
-        <w:rPr>
-          <w:rFonts w:ascii="Cambria Math" w:eastAsia="Cambria Math" w:hAnsi="Cambria Math" w:cs="Cambria Math"/>
-          <w:color w:val="1B2A4A"/>
-          <w:sz w:val="24"/>
-          <w:szCs w:val="24"/>
-        </w:rPr>
-        <w:t xml:space="preserve">  </w:t>
-      </w:r>
-      <w:proofErr w:type="spellStart"/>
-      <w:r>
-        <w:rPr>
-          <w:rFonts w:ascii="Cambria Math" w:eastAsia="Cambria Math" w:hAnsi="Cambria Math" w:cs="Cambria Math"/>
-          <w:color w:val="1B2A4A"/>
-          <w:sz w:val="24"/>
-          <w:szCs w:val="24"/>
-        </w:rPr>
-        <w:t>sin</w:t>
-      </w:r>
-      <w:proofErr w:type="gramStart"/>
-      <w:r>
-        <w:rPr>
-          <w:rFonts w:ascii="Cambria Math" w:eastAsia="Cambria Math" w:hAnsi="Cambria Math" w:cs="Cambria Math"/>
-          <w:color w:val="1B2A4A"/>
-          <w:sz w:val="24"/>
-          <w:szCs w:val="24"/>
-        </w:rPr>
-        <w:t>θ</w:t>
-      </w:r>
-      <w:proofErr w:type="spellEnd"/>
-      <w:r>
-        <w:rPr>
-          <w:rFonts w:ascii="Cambria Math" w:eastAsia="Cambria Math" w:hAnsi="Cambria Math" w:cs="Cambria Math"/>
-          <w:color w:val="1B2A4A"/>
-          <w:sz w:val="24"/>
-          <w:szCs w:val="24"/>
-        </w:rPr>
-        <w:t xml:space="preserve">  </w:t>
-      </w:r>
-      <w:proofErr w:type="spellStart"/>
-      <w:r>
-        <w:rPr>
-          <w:rFonts w:ascii="Cambria Math" w:eastAsia="Cambria Math" w:hAnsi="Cambria Math" w:cs="Cambria Math"/>
-          <w:color w:val="1B2A4A"/>
-          <w:sz w:val="24"/>
-          <w:szCs w:val="24"/>
-        </w:rPr>
-        <w:t>cosθ</w:t>
-      </w:r>
-      <w:proofErr w:type="spellEnd"/>
-      <w:r>
-        <w:rPr>
-          <w:rFonts w:ascii="Cambria Math" w:eastAsia="Cambria Math" w:hAnsi="Cambria Math" w:cs="Cambria Math"/>
-          <w:color w:val="1B2A4A"/>
-          <w:sz w:val="24"/>
-          <w:szCs w:val="24"/>
-        </w:rPr>
-        <w:t xml:space="preserve"> ]</w:t>
-      </w:r>
-      <w:proofErr w:type="gramEnd"/>
+        <w:t xml:space="preserve">R(θ) = [ cosθ  −sinθ ;  sinθ  cosθ ]</w:t>
+      </w:r>
       <w:r>
         <w:rPr>
           <w:color w:val="666666"/>
@@ -1582,23 +1357,7 @@
         <w:spacing w:after="160" w:line="300" w:lineRule="auto"/>
       </w:pPr>
       <w:r>
-        <w:t xml:space="preserve">This 2×2 matrix can rotate a point, but it cannot translate it. To combine rotation and translation in a single matrix multiplication, we embed R in a 3×3 matrix and represent positions as [x, y, </w:t>
-      </w:r>
-      <w:proofErr w:type="gramStart"/>
-      <w:r>
-        <w:t>1]ᵀ.</w:t>
-      </w:r>
-      <w:proofErr w:type="gramEnd"/>
-      <w:r>
-        <w:t xml:space="preserve"> The third coordinate is a dummy that rides along unchanged—its only purpose is to let the translation terms in the right column get added during multiplication. The bottom row [</w:t>
-      </w:r>
-      <w:proofErr w:type="gramStart"/>
-      <w:r>
-        <w:t>0  0</w:t>
-      </w:r>
-      <w:proofErr w:type="gramEnd"/>
-      <w:r>
-        <w:t xml:space="preserve">  1] preserves this structure. For the first link:</w:t>
+        <w:t xml:space="preserve">This 2×2 matrix can rotate a point, but it cannot translate it. To combine rotation and translation in a single matrix multiplication, we embed R in a 3×3 matrix and represent positions as [x, y, 1]ᵀ. The third coordinate is a dummy that rides along unchanged—its only purpose is to let the translation terms in the right column get added during multiplication. The bottom row [0  0  1] preserves this structure. For the first link:</w:t>
       </w:r>
     </w:p>
     <w:p>
@@ -1617,216 +1376,8 @@
           <w:sz w:val="24"/>
           <w:szCs w:val="24"/>
         </w:rPr>
-        <w:t xml:space="preserve">T₁ = [ </w:t>
-      </w:r>
-      <w:proofErr w:type="spellStart"/>
-      <w:r>
-        <w:rPr>
-          <w:rFonts w:ascii="Cambria Math" w:eastAsia="Cambria Math" w:hAnsi="Cambria Math" w:cs="Cambria Math"/>
-          <w:color w:val="1B2A4A"/>
-          <w:sz w:val="24"/>
-          <w:szCs w:val="24"/>
-        </w:rPr>
-        <w:t>cosθ</w:t>
-      </w:r>
-      <w:proofErr w:type="spellEnd"/>
-      <w:proofErr w:type="gramStart"/>
-      <w:r>
-        <w:rPr>
-          <w:rFonts w:ascii="Cambria Math" w:eastAsia="Cambria Math" w:hAnsi="Cambria Math" w:cs="Cambria Math"/>
-          <w:color w:val="1B2A4A"/>
-          <w:sz w:val="24"/>
-          <w:szCs w:val="24"/>
-        </w:rPr>
-        <w:t>₁  −</w:t>
-      </w:r>
-      <w:proofErr w:type="spellStart"/>
-      <w:proofErr w:type="gramEnd"/>
-      <w:r>
-        <w:rPr>
-          <w:rFonts w:ascii="Cambria Math" w:eastAsia="Cambria Math" w:hAnsi="Cambria Math" w:cs="Cambria Math"/>
-          <w:color w:val="1B2A4A"/>
-          <w:sz w:val="24"/>
-          <w:szCs w:val="24"/>
-        </w:rPr>
-        <w:t>sinθ</w:t>
-      </w:r>
-      <w:proofErr w:type="spellEnd"/>
-      <w:proofErr w:type="gramStart"/>
-      <w:r>
-        <w:rPr>
-          <w:rFonts w:ascii="Cambria Math" w:eastAsia="Cambria Math" w:hAnsi="Cambria Math" w:cs="Cambria Math"/>
-          <w:color w:val="1B2A4A"/>
-          <w:sz w:val="24"/>
-          <w:szCs w:val="24"/>
-        </w:rPr>
-        <w:t xml:space="preserve">₁  </w:t>
-      </w:r>
-      <w:proofErr w:type="spellStart"/>
-      <w:r>
-        <w:rPr>
-          <w:rFonts w:ascii="Cambria Math" w:eastAsia="Cambria Math" w:hAnsi="Cambria Math" w:cs="Cambria Math"/>
-          <w:color w:val="1B2A4A"/>
-          <w:sz w:val="24"/>
-          <w:szCs w:val="24"/>
-        </w:rPr>
-        <w:t>l</w:t>
-      </w:r>
-      <w:proofErr w:type="gramEnd"/>
-      <w:r>
-        <w:rPr>
-          <w:rFonts w:ascii="Cambria Math" w:eastAsia="Cambria Math" w:hAnsi="Cambria Math" w:cs="Cambria Math"/>
-          <w:color w:val="1B2A4A"/>
-          <w:sz w:val="24"/>
-          <w:szCs w:val="24"/>
-        </w:rPr>
-        <w:t>₁cosθ</w:t>
-      </w:r>
-      <w:proofErr w:type="spellEnd"/>
-      <w:proofErr w:type="gramStart"/>
-      <w:r>
-        <w:rPr>
-          <w:rFonts w:ascii="Cambria Math" w:eastAsia="Cambria Math" w:hAnsi="Cambria Math" w:cs="Cambria Math"/>
-          <w:color w:val="1B2A4A"/>
-          <w:sz w:val="24"/>
-          <w:szCs w:val="24"/>
-        </w:rPr>
-        <w:t>₁ ;</w:t>
-      </w:r>
-      <w:proofErr w:type="gramEnd"/>
-      <w:r>
-        <w:rPr>
-          <w:rFonts w:ascii="Cambria Math" w:eastAsia="Cambria Math" w:hAnsi="Cambria Math" w:cs="Cambria Math"/>
-          <w:color w:val="1B2A4A"/>
-          <w:sz w:val="24"/>
-          <w:szCs w:val="24"/>
-        </w:rPr>
-        <w:t xml:space="preserve">  </w:t>
-      </w:r>
-      <w:proofErr w:type="spellStart"/>
-      <w:r>
-        <w:rPr>
-          <w:rFonts w:ascii="Cambria Math" w:eastAsia="Cambria Math" w:hAnsi="Cambria Math" w:cs="Cambria Math"/>
-          <w:color w:val="1B2A4A"/>
-          <w:sz w:val="24"/>
-          <w:szCs w:val="24"/>
-        </w:rPr>
-        <w:t>sinθ</w:t>
-      </w:r>
-      <w:proofErr w:type="spellEnd"/>
-      <w:proofErr w:type="gramStart"/>
-      <w:r>
-        <w:rPr>
-          <w:rFonts w:ascii="Cambria Math" w:eastAsia="Cambria Math" w:hAnsi="Cambria Math" w:cs="Cambria Math"/>
-          <w:color w:val="1B2A4A"/>
-          <w:sz w:val="24"/>
-          <w:szCs w:val="24"/>
-        </w:rPr>
-        <w:t xml:space="preserve">₁  </w:t>
-      </w:r>
-      <w:proofErr w:type="spellStart"/>
-      <w:r>
-        <w:rPr>
-          <w:rFonts w:ascii="Cambria Math" w:eastAsia="Cambria Math" w:hAnsi="Cambria Math" w:cs="Cambria Math"/>
-          <w:color w:val="1B2A4A"/>
-          <w:sz w:val="24"/>
-          <w:szCs w:val="24"/>
-        </w:rPr>
-        <w:t>cos</w:t>
-      </w:r>
-      <w:proofErr w:type="gramEnd"/>
-      <w:r>
-        <w:rPr>
-          <w:rFonts w:ascii="Cambria Math" w:eastAsia="Cambria Math" w:hAnsi="Cambria Math" w:cs="Cambria Math"/>
-          <w:color w:val="1B2A4A"/>
-          <w:sz w:val="24"/>
-          <w:szCs w:val="24"/>
-        </w:rPr>
-        <w:t>θ</w:t>
-      </w:r>
-      <w:proofErr w:type="spellEnd"/>
-      <w:proofErr w:type="gramStart"/>
-      <w:r>
-        <w:rPr>
-          <w:rFonts w:ascii="Cambria Math" w:eastAsia="Cambria Math" w:hAnsi="Cambria Math" w:cs="Cambria Math"/>
-          <w:color w:val="1B2A4A"/>
-          <w:sz w:val="24"/>
-          <w:szCs w:val="24"/>
-        </w:rPr>
-        <w:t xml:space="preserve">₁  </w:t>
-      </w:r>
-      <w:proofErr w:type="spellStart"/>
-      <w:r>
-        <w:rPr>
-          <w:rFonts w:ascii="Cambria Math" w:eastAsia="Cambria Math" w:hAnsi="Cambria Math" w:cs="Cambria Math"/>
-          <w:color w:val="1B2A4A"/>
-          <w:sz w:val="24"/>
-          <w:szCs w:val="24"/>
-        </w:rPr>
-        <w:t>l</w:t>
-      </w:r>
-      <w:proofErr w:type="gramEnd"/>
-      <w:r>
-        <w:rPr>
-          <w:rFonts w:ascii="Cambria Math" w:eastAsia="Cambria Math" w:hAnsi="Cambria Math" w:cs="Cambria Math"/>
-          <w:color w:val="1B2A4A"/>
-          <w:sz w:val="24"/>
-          <w:szCs w:val="24"/>
-        </w:rPr>
-        <w:t>₁sinθ</w:t>
-      </w:r>
-      <w:proofErr w:type="spellEnd"/>
-      <w:proofErr w:type="gramStart"/>
-      <w:r>
-        <w:rPr>
-          <w:rFonts w:ascii="Cambria Math" w:eastAsia="Cambria Math" w:hAnsi="Cambria Math" w:cs="Cambria Math"/>
-          <w:color w:val="1B2A4A"/>
-          <w:sz w:val="24"/>
-          <w:szCs w:val="24"/>
-        </w:rPr>
-        <w:t>₁ ;</w:t>
-      </w:r>
-      <w:proofErr w:type="gramEnd"/>
-      <w:r>
-        <w:rPr>
-          <w:rFonts w:ascii="Cambria Math" w:eastAsia="Cambria Math" w:hAnsi="Cambria Math" w:cs="Cambria Math"/>
-          <w:color w:val="1B2A4A"/>
-          <w:sz w:val="24"/>
-          <w:szCs w:val="24"/>
-        </w:rPr>
-        <w:t xml:space="preserve">  </w:t>
-      </w:r>
-      <w:proofErr w:type="gramStart"/>
-      <w:r>
-        <w:rPr>
-          <w:rFonts w:ascii="Cambria Math" w:eastAsia="Cambria Math" w:hAnsi="Cambria Math" w:cs="Cambria Math"/>
-          <w:color w:val="1B2A4A"/>
-          <w:sz w:val="24"/>
-          <w:szCs w:val="24"/>
-        </w:rPr>
-        <w:t>0  0</w:t>
-      </w:r>
-      <w:proofErr w:type="gramEnd"/>
-      <w:r>
-        <w:rPr>
-          <w:rFonts w:ascii="Cambria Math" w:eastAsia="Cambria Math" w:hAnsi="Cambria Math" w:cs="Cambria Math"/>
-          <w:color w:val="1B2A4A"/>
-          <w:sz w:val="24"/>
-          <w:szCs w:val="24"/>
-        </w:rPr>
-        <w:t xml:space="preserve">  </w:t>
-      </w:r>
-      <w:proofErr w:type="gramStart"/>
-      <w:r>
-        <w:rPr>
-          <w:rFonts w:ascii="Cambria Math" w:eastAsia="Cambria Math" w:hAnsi="Cambria Math" w:cs="Cambria Math"/>
-          <w:color w:val="1B2A4A"/>
-          <w:sz w:val="24"/>
-          <w:szCs w:val="24"/>
-        </w:rPr>
-        <w:t>1 ]</w:t>
-      </w:r>
-      <w:proofErr w:type="gramEnd"/>
+        <w:t xml:space="preserve">T₁ = [ cosθ₁  −sinθ₁  l₁cosθ₁ ;  sinθ₁  cosθ₁  l₁sinθ₁ ;  0  0  1 ]</w:t>
+      </w:r>
       <w:r>
         <w:rPr>
           <w:color w:val="666666"/>
@@ -1862,216 +1413,8 @@
           <w:szCs w:val="24"/>
         </w:rPr>
         <w:lastRenderedPageBreak/>
-        <w:t xml:space="preserve">T₂ = [ </w:t>
-      </w:r>
-      <w:proofErr w:type="spellStart"/>
-      <w:r>
-        <w:rPr>
-          <w:rFonts w:ascii="Cambria Math" w:eastAsia="Cambria Math" w:hAnsi="Cambria Math" w:cs="Cambria Math"/>
-          <w:color w:val="1B2A4A"/>
-          <w:sz w:val="24"/>
-          <w:szCs w:val="24"/>
-        </w:rPr>
-        <w:t>cosθ</w:t>
-      </w:r>
-      <w:proofErr w:type="spellEnd"/>
-      <w:proofErr w:type="gramStart"/>
-      <w:r>
-        <w:rPr>
-          <w:rFonts w:ascii="Cambria Math" w:eastAsia="Cambria Math" w:hAnsi="Cambria Math" w:cs="Cambria Math"/>
-          <w:color w:val="1B2A4A"/>
-          <w:sz w:val="24"/>
-          <w:szCs w:val="24"/>
-        </w:rPr>
-        <w:t>₂  −</w:t>
-      </w:r>
-      <w:proofErr w:type="spellStart"/>
-      <w:proofErr w:type="gramEnd"/>
-      <w:r>
-        <w:rPr>
-          <w:rFonts w:ascii="Cambria Math" w:eastAsia="Cambria Math" w:hAnsi="Cambria Math" w:cs="Cambria Math"/>
-          <w:color w:val="1B2A4A"/>
-          <w:sz w:val="24"/>
-          <w:szCs w:val="24"/>
-        </w:rPr>
-        <w:t>sinθ</w:t>
-      </w:r>
-      <w:proofErr w:type="spellEnd"/>
-      <w:proofErr w:type="gramStart"/>
-      <w:r>
-        <w:rPr>
-          <w:rFonts w:ascii="Cambria Math" w:eastAsia="Cambria Math" w:hAnsi="Cambria Math" w:cs="Cambria Math"/>
-          <w:color w:val="1B2A4A"/>
-          <w:sz w:val="24"/>
-          <w:szCs w:val="24"/>
-        </w:rPr>
-        <w:t xml:space="preserve">₂  </w:t>
-      </w:r>
-      <w:proofErr w:type="spellStart"/>
-      <w:r>
-        <w:rPr>
-          <w:rFonts w:ascii="Cambria Math" w:eastAsia="Cambria Math" w:hAnsi="Cambria Math" w:cs="Cambria Math"/>
-          <w:color w:val="1B2A4A"/>
-          <w:sz w:val="24"/>
-          <w:szCs w:val="24"/>
-        </w:rPr>
-        <w:t>l</w:t>
-      </w:r>
-      <w:proofErr w:type="gramEnd"/>
-      <w:r>
-        <w:rPr>
-          <w:rFonts w:ascii="Cambria Math" w:eastAsia="Cambria Math" w:hAnsi="Cambria Math" w:cs="Cambria Math"/>
-          <w:color w:val="1B2A4A"/>
-          <w:sz w:val="24"/>
-          <w:szCs w:val="24"/>
-        </w:rPr>
-        <w:t>₂cosθ</w:t>
-      </w:r>
-      <w:proofErr w:type="spellEnd"/>
-      <w:proofErr w:type="gramStart"/>
-      <w:r>
-        <w:rPr>
-          <w:rFonts w:ascii="Cambria Math" w:eastAsia="Cambria Math" w:hAnsi="Cambria Math" w:cs="Cambria Math"/>
-          <w:color w:val="1B2A4A"/>
-          <w:sz w:val="24"/>
-          <w:szCs w:val="24"/>
-        </w:rPr>
-        <w:t>₂ ;</w:t>
-      </w:r>
-      <w:proofErr w:type="gramEnd"/>
-      <w:r>
-        <w:rPr>
-          <w:rFonts w:ascii="Cambria Math" w:eastAsia="Cambria Math" w:hAnsi="Cambria Math" w:cs="Cambria Math"/>
-          <w:color w:val="1B2A4A"/>
-          <w:sz w:val="24"/>
-          <w:szCs w:val="24"/>
-        </w:rPr>
-        <w:t xml:space="preserve">  </w:t>
-      </w:r>
-      <w:proofErr w:type="spellStart"/>
-      <w:r>
-        <w:rPr>
-          <w:rFonts w:ascii="Cambria Math" w:eastAsia="Cambria Math" w:hAnsi="Cambria Math" w:cs="Cambria Math"/>
-          <w:color w:val="1B2A4A"/>
-          <w:sz w:val="24"/>
-          <w:szCs w:val="24"/>
-        </w:rPr>
-        <w:t>sinθ</w:t>
-      </w:r>
-      <w:proofErr w:type="spellEnd"/>
-      <w:proofErr w:type="gramStart"/>
-      <w:r>
-        <w:rPr>
-          <w:rFonts w:ascii="Cambria Math" w:eastAsia="Cambria Math" w:hAnsi="Cambria Math" w:cs="Cambria Math"/>
-          <w:color w:val="1B2A4A"/>
-          <w:sz w:val="24"/>
-          <w:szCs w:val="24"/>
-        </w:rPr>
-        <w:t xml:space="preserve">₂  </w:t>
-      </w:r>
-      <w:proofErr w:type="spellStart"/>
-      <w:r>
-        <w:rPr>
-          <w:rFonts w:ascii="Cambria Math" w:eastAsia="Cambria Math" w:hAnsi="Cambria Math" w:cs="Cambria Math"/>
-          <w:color w:val="1B2A4A"/>
-          <w:sz w:val="24"/>
-          <w:szCs w:val="24"/>
-        </w:rPr>
-        <w:t>cos</w:t>
-      </w:r>
-      <w:proofErr w:type="gramEnd"/>
-      <w:r>
-        <w:rPr>
-          <w:rFonts w:ascii="Cambria Math" w:eastAsia="Cambria Math" w:hAnsi="Cambria Math" w:cs="Cambria Math"/>
-          <w:color w:val="1B2A4A"/>
-          <w:sz w:val="24"/>
-          <w:szCs w:val="24"/>
-        </w:rPr>
-        <w:t>θ</w:t>
-      </w:r>
-      <w:proofErr w:type="spellEnd"/>
-      <w:proofErr w:type="gramStart"/>
-      <w:r>
-        <w:rPr>
-          <w:rFonts w:ascii="Cambria Math" w:eastAsia="Cambria Math" w:hAnsi="Cambria Math" w:cs="Cambria Math"/>
-          <w:color w:val="1B2A4A"/>
-          <w:sz w:val="24"/>
-          <w:szCs w:val="24"/>
-        </w:rPr>
-        <w:t xml:space="preserve">₂  </w:t>
-      </w:r>
-      <w:proofErr w:type="spellStart"/>
-      <w:r>
-        <w:rPr>
-          <w:rFonts w:ascii="Cambria Math" w:eastAsia="Cambria Math" w:hAnsi="Cambria Math" w:cs="Cambria Math"/>
-          <w:color w:val="1B2A4A"/>
-          <w:sz w:val="24"/>
-          <w:szCs w:val="24"/>
-        </w:rPr>
-        <w:t>l</w:t>
-      </w:r>
-      <w:proofErr w:type="gramEnd"/>
-      <w:r>
-        <w:rPr>
-          <w:rFonts w:ascii="Cambria Math" w:eastAsia="Cambria Math" w:hAnsi="Cambria Math" w:cs="Cambria Math"/>
-          <w:color w:val="1B2A4A"/>
-          <w:sz w:val="24"/>
-          <w:szCs w:val="24"/>
-        </w:rPr>
-        <w:t>₂sinθ</w:t>
-      </w:r>
-      <w:proofErr w:type="spellEnd"/>
-      <w:proofErr w:type="gramStart"/>
-      <w:r>
-        <w:rPr>
-          <w:rFonts w:ascii="Cambria Math" w:eastAsia="Cambria Math" w:hAnsi="Cambria Math" w:cs="Cambria Math"/>
-          <w:color w:val="1B2A4A"/>
-          <w:sz w:val="24"/>
-          <w:szCs w:val="24"/>
-        </w:rPr>
-        <w:t>₂ ;</w:t>
-      </w:r>
-      <w:proofErr w:type="gramEnd"/>
-      <w:r>
-        <w:rPr>
-          <w:rFonts w:ascii="Cambria Math" w:eastAsia="Cambria Math" w:hAnsi="Cambria Math" w:cs="Cambria Math"/>
-          <w:color w:val="1B2A4A"/>
-          <w:sz w:val="24"/>
-          <w:szCs w:val="24"/>
-        </w:rPr>
-        <w:t xml:space="preserve">  </w:t>
-      </w:r>
-      <w:proofErr w:type="gramStart"/>
-      <w:r>
-        <w:rPr>
-          <w:rFonts w:ascii="Cambria Math" w:eastAsia="Cambria Math" w:hAnsi="Cambria Math" w:cs="Cambria Math"/>
-          <w:color w:val="1B2A4A"/>
-          <w:sz w:val="24"/>
-          <w:szCs w:val="24"/>
-        </w:rPr>
-        <w:t>0  0</w:t>
-      </w:r>
-      <w:proofErr w:type="gramEnd"/>
-      <w:r>
-        <w:rPr>
-          <w:rFonts w:ascii="Cambria Math" w:eastAsia="Cambria Math" w:hAnsi="Cambria Math" w:cs="Cambria Math"/>
-          <w:color w:val="1B2A4A"/>
-          <w:sz w:val="24"/>
-          <w:szCs w:val="24"/>
-        </w:rPr>
-        <w:t xml:space="preserve">  </w:t>
-      </w:r>
-      <w:proofErr w:type="gramStart"/>
-      <w:r>
-        <w:rPr>
-          <w:rFonts w:ascii="Cambria Math" w:eastAsia="Cambria Math" w:hAnsi="Cambria Math" w:cs="Cambria Math"/>
-          <w:color w:val="1B2A4A"/>
-          <w:sz w:val="24"/>
-          <w:szCs w:val="24"/>
-        </w:rPr>
-        <w:t>1 ]</w:t>
-      </w:r>
-      <w:proofErr w:type="gramEnd"/>
+        <w:t xml:space="preserve">T₂ = [ cosθ₂  −sinθ₂  l₂cosθ₂ ;  sinθ₂  cosθ₂  l₂sinθ₂ ;  0  0  1 ]</w:t>
+      </w:r>
       <w:r>
         <w:rPr>
           <w:color w:val="666666"/>
@@ -2142,67 +1485,7 @@
           <w:sz w:val="24"/>
           <w:szCs w:val="24"/>
         </w:rPr>
-        <w:t>cos(θ</w:t>
-      </w:r>
-      <w:proofErr w:type="gramStart"/>
-      <w:r>
-        <w:rPr>
-          <w:rFonts w:ascii="Cambria Math" w:eastAsia="Cambria Math" w:hAnsi="Cambria Math" w:cs="Cambria Math"/>
-          <w:color w:val="1B2A4A"/>
-          <w:sz w:val="24"/>
-          <w:szCs w:val="24"/>
-        </w:rPr>
-        <w:t>₁)·</w:t>
-      </w:r>
-      <w:proofErr w:type="gramEnd"/>
-      <w:r>
-        <w:rPr>
-          <w:rFonts w:ascii="Cambria Math" w:eastAsia="Cambria Math" w:hAnsi="Cambria Math" w:cs="Cambria Math"/>
-          <w:color w:val="1B2A4A"/>
-          <w:sz w:val="24"/>
-          <w:szCs w:val="24"/>
-        </w:rPr>
-        <w:t>cos(θ₂) − sin(θ</w:t>
-      </w:r>
-      <w:proofErr w:type="gramStart"/>
-      <w:r>
-        <w:rPr>
-          <w:rFonts w:ascii="Cambria Math" w:eastAsia="Cambria Math" w:hAnsi="Cambria Math" w:cs="Cambria Math"/>
-          <w:color w:val="1B2A4A"/>
-          <w:sz w:val="24"/>
-          <w:szCs w:val="24"/>
-        </w:rPr>
-        <w:t>₁)·</w:t>
-      </w:r>
-      <w:proofErr w:type="gramEnd"/>
-      <w:r>
-        <w:rPr>
-          <w:rFonts w:ascii="Cambria Math" w:eastAsia="Cambria Math" w:hAnsi="Cambria Math" w:cs="Cambria Math"/>
-          <w:color w:val="1B2A4A"/>
-          <w:sz w:val="24"/>
-          <w:szCs w:val="24"/>
-        </w:rPr>
-        <w:t xml:space="preserve">sin(θ₂) = </w:t>
-      </w:r>
-      <w:proofErr w:type="gramStart"/>
-      <w:r>
-        <w:rPr>
-          <w:rFonts w:ascii="Cambria Math" w:eastAsia="Cambria Math" w:hAnsi="Cambria Math" w:cs="Cambria Math"/>
-          <w:color w:val="1B2A4A"/>
-          <w:sz w:val="24"/>
-          <w:szCs w:val="24"/>
-        </w:rPr>
-        <w:t>cos(</w:t>
-      </w:r>
-      <w:proofErr w:type="gramEnd"/>
-      <w:r>
-        <w:rPr>
-          <w:rFonts w:ascii="Cambria Math" w:eastAsia="Cambria Math" w:hAnsi="Cambria Math" w:cs="Cambria Math"/>
-          <w:color w:val="1B2A4A"/>
-          <w:sz w:val="24"/>
-          <w:szCs w:val="24"/>
-        </w:rPr>
-        <w:t>θ₁ + θ₂)</w:t>
+        <w:t xml:space="preserve">cos(θ₁)·cos(θ₂) − sin(θ₁)·sin(θ₂) = cos(θ₁ + θ₂)</w:t>
       </w:r>
       <w:r>
         <w:rPr>
@@ -2291,13 +1574,8 @@
           <w:bottom w:val="single" w:sz="2" w:space="4" w:color="2E86AB"/>
         </w:pBdr>
       </w:pPr>
-      <w:proofErr w:type="gramStart"/>
-      <w:r>
-        <w:t>2.3  The</w:t>
-      </w:r>
-      <w:proofErr w:type="gramEnd"/>
-      <w:r>
-        <w:t xml:space="preserve"> Workspace</w:t>
+      <w:r>
+        <w:t xml:space="preserve">2.3  The Workspace</w:t>
       </w:r>
     </w:p>
     <w:p>
@@ -2373,23 +1651,7 @@
         <w:t>ₘᵢₙ</w:t>
       </w:r>
       <w:r>
-        <w:t xml:space="preserve"> = </w:t>
-      </w:r>
-      <w:proofErr w:type="gramStart"/>
-      <w:r>
-        <w:t>√(</w:t>
-      </w:r>
-      <w:proofErr w:type="gramEnd"/>
-      <w:r>
-        <w:t>l₁² + l₂² + 2l₁l₂</w:t>
-      </w:r>
-      <w:proofErr w:type="gramStart"/>
-      <w:r>
-        <w:t>cos(</w:t>
-      </w:r>
-      <w:proofErr w:type="gramEnd"/>
-      <w:r>
-        <w:t>145°)) ≈ 0.19 m.</w:t>
+        <w:t xml:space="preserve"> = √(l₁² + l₂² + 2l₁l₂cos(145°)) ≈ 0.19 m.</w:t>
       </w:r>
     </w:p>
     <w:p>
@@ -2434,27 +1696,7 @@
           <w:sz w:val="24"/>
           <w:szCs w:val="24"/>
         </w:rPr>
-        <w:t xml:space="preserve">|l₁ − l₂| ≤ </w:t>
-      </w:r>
-      <w:proofErr w:type="gramStart"/>
-      <w:r>
-        <w:rPr>
-          <w:rFonts w:ascii="Cambria Math" w:eastAsia="Cambria Math" w:hAnsi="Cambria Math" w:cs="Cambria Math"/>
-          <w:color w:val="1B2A4A"/>
-          <w:sz w:val="24"/>
-          <w:szCs w:val="24"/>
-        </w:rPr>
-        <w:t>√(</w:t>
-      </w:r>
-      <w:proofErr w:type="gramEnd"/>
-      <w:r>
-        <w:rPr>
-          <w:rFonts w:ascii="Cambria Math" w:eastAsia="Cambria Math" w:hAnsi="Cambria Math" w:cs="Cambria Math"/>
-          <w:color w:val="1B2A4A"/>
-          <w:sz w:val="24"/>
-          <w:szCs w:val="24"/>
-        </w:rPr>
-        <w:t>x² + y²) ≤ l₁ + l₂</w:t>
+        <w:t xml:space="preserve">|l₁ − l₂| ≤ √(x² + y²) ≤ l₁ + l₂</w:t>
       </w:r>
       <w:r>
         <w:rPr>
@@ -2472,15 +1714,7 @@
       </w:pPr>
       <w:r>
         <w:lastRenderedPageBreak/>
-        <w:t xml:space="preserve">However, with the joint limits θ₁ ∈ [0°, 140°] and θ₂ ∈ [0°, 145°], only a subset of this annulus is </w:t>
-      </w:r>
-      <w:proofErr w:type="gramStart"/>
-      <w:r>
-        <w:t>actually reachable</w:t>
-      </w:r>
-      <w:proofErr w:type="gramEnd"/>
-      <w:r>
-        <w:t>. In the lab, you will visualize the true workspace by sweeping through all valid joint configurations.</w:t>
+        <w:t xml:space="preserve">However, with the joint limits θ₁ ∈ [0°, 140°] and θ₂ ∈ [0°, 145°], only a subset of this annulus is actually reachable. In the lab, you will visualize the true workspace by sweeping through all valid joint configurations.</w:t>
       </w:r>
     </w:p>
     <w:p>
@@ -2610,13 +1844,8 @@
           <w:bottom w:val="single" w:sz="2" w:space="4" w:color="2E86AB"/>
         </w:pBdr>
       </w:pPr>
-      <w:proofErr w:type="gramStart"/>
-      <w:r>
-        <w:t>3.1  Solving</w:t>
-      </w:r>
-      <w:proofErr w:type="gramEnd"/>
-      <w:r>
-        <w:t xml:space="preserve"> for θ₂ (Elbow Angle)</w:t>
+      <w:r>
+        <w:t xml:space="preserve">3.1  Solving for θ₂ (Elbow Angle)</w:t>
       </w:r>
     </w:p>
     <w:p>
@@ -2748,7 +1977,6 @@
         <w:ind w:left="720"/>
         <w:jc w:val="center"/>
       </w:pPr>
-      <w:proofErr w:type="spellStart"/>
       <w:r>
         <w:rPr>
           <w:rFonts w:ascii="Cambria Math" w:eastAsia="Cambria Math" w:hAnsi="Cambria Math" w:cs="Cambria Math"/>
@@ -2756,37 +1984,7 @@
           <w:sz w:val="24"/>
           <w:szCs w:val="24"/>
         </w:rPr>
-        <w:t>cosθ₁cos</w:t>
-      </w:r>
-      <w:proofErr w:type="spellEnd"/>
-      <w:r>
-        <w:rPr>
-          <w:rFonts w:ascii="Cambria Math" w:eastAsia="Cambria Math" w:hAnsi="Cambria Math" w:cs="Cambria Math"/>
-          <w:color w:val="1B2A4A"/>
-          <w:sz w:val="24"/>
-          <w:szCs w:val="24"/>
-        </w:rPr>
-        <w:t xml:space="preserve">(θ₁+θ₂) + </w:t>
-      </w:r>
-      <w:proofErr w:type="spellStart"/>
-      <w:r>
-        <w:rPr>
-          <w:rFonts w:ascii="Cambria Math" w:eastAsia="Cambria Math" w:hAnsi="Cambria Math" w:cs="Cambria Math"/>
-          <w:color w:val="1B2A4A"/>
-          <w:sz w:val="24"/>
-          <w:szCs w:val="24"/>
-        </w:rPr>
-        <w:t>sinθ₁sin</w:t>
-      </w:r>
-      <w:proofErr w:type="spellEnd"/>
-      <w:r>
-        <w:rPr>
-          <w:rFonts w:ascii="Cambria Math" w:eastAsia="Cambria Math" w:hAnsi="Cambria Math" w:cs="Cambria Math"/>
-          <w:color w:val="1B2A4A"/>
-          <w:sz w:val="24"/>
-          <w:szCs w:val="24"/>
-        </w:rPr>
-        <w:t>(θ₁+θ₂) = cos(θ₂)</w:t>
+        <w:t xml:space="preserve">cosθ₁cos(θ₁+θ₂) + sinθ₁sin(θ₁+θ₂) = cos(θ₂)</w:t>
       </w:r>
       <w:r>
         <w:rPr>
@@ -2868,27 +2066,7 @@
           <w:sz w:val="24"/>
           <w:szCs w:val="24"/>
         </w:rPr>
-        <w:t xml:space="preserve">θ₂ = ± </w:t>
-      </w:r>
-      <w:proofErr w:type="spellStart"/>
-      <w:r>
-        <w:rPr>
-          <w:rFonts w:ascii="Cambria Math" w:eastAsia="Cambria Math" w:hAnsi="Cambria Math" w:cs="Cambria Math"/>
-          <w:color w:val="1B2A4A"/>
-          <w:sz w:val="24"/>
-          <w:szCs w:val="24"/>
-        </w:rPr>
-        <w:t>arccos</w:t>
-      </w:r>
-      <w:proofErr w:type="spellEnd"/>
-      <w:r>
-        <w:rPr>
-          <w:rFonts w:ascii="Cambria Math" w:eastAsia="Cambria Math" w:hAnsi="Cambria Math" w:cs="Cambria Math"/>
-          <w:color w:val="1B2A4A"/>
-          <w:sz w:val="24"/>
-          <w:szCs w:val="24"/>
-        </w:rPr>
-        <w:t>(c₂)</w:t>
+        <w:t xml:space="preserve">θ₂ = ± arccos(c₂)</w:t>
       </w:r>
       <w:r>
         <w:rPr>
@@ -2943,13 +2121,8 @@
           <w:bottom w:val="single" w:sz="2" w:space="4" w:color="2E86AB"/>
         </w:pBdr>
       </w:pPr>
-      <w:proofErr w:type="gramStart"/>
-      <w:r>
-        <w:t>3.2  Solving</w:t>
-      </w:r>
-      <w:proofErr w:type="gramEnd"/>
-      <w:r>
-        <w:t xml:space="preserve"> for θ₁ (Shoulder Angle)</w:t>
+      <w:r>
+        <w:t xml:space="preserve">3.2  Solving for θ₁ (Shoulder Angle)</w:t>
       </w:r>
     </w:p>
     <w:p>
@@ -3055,27 +2228,7 @@
                 <w:bCs/>
                 <w:color w:val="2E86AB"/>
               </w:rPr>
-              <w:t xml:space="preserve">What </w:t>
-            </w:r>
-            <w:proofErr w:type="gramStart"/>
-            <w:r>
-              <w:rPr>
-                <w:rFonts w:ascii="Georgia" w:eastAsia="Georgia" w:hAnsi="Georgia" w:cs="Georgia"/>
-                <w:b/>
-                <w:bCs/>
-                <w:color w:val="2E86AB"/>
-              </w:rPr>
-              <w:t>are</w:t>
-            </w:r>
-            <w:proofErr w:type="gramEnd"/>
-            <w:r>
-              <w:rPr>
-                <w:rFonts w:ascii="Georgia" w:eastAsia="Georgia" w:hAnsi="Georgia" w:cs="Georgia"/>
-                <w:b/>
-                <w:bCs/>
-                <w:color w:val="2E86AB"/>
-              </w:rPr>
-              <w:t xml:space="preserve"> k₁ and k₂?</w:t>
+              <w:t xml:space="preserve">What are k₁ and k₂?</w:t>
             </w:r>
           </w:p>
           <w:p>
@@ -3196,6 +2349,71 @@
       </w:pPr>
       <w:r>
         <w:t>The full derivation: rewrite Equations 3.7a–3.7b in matrix form as a rotation applied to the vector (k₁, k₂). The angle of the target vector (x, y) is atan2(y, x), and the angle of (k₁, k₂) is atan2(k₂, k₁). The difference gives θ₁.</w:t>
+      </w:r>
+    </w:p>
+    <w:p>
+      <w:pPr>
+        <w:keepNext/>
+        <w:spacing w:before="200" w:after="80"/>
+        <w:jc w:val="center"/>
+      </w:pPr>
+      <w:r>
+        <w:rPr>
+          <w:noProof/>
+        </w:rPr>
+        <w:drawing>
+          <wp:inline distT="0" distB="0" distL="0" distR="0">
+            <wp:extent cx="5334000" cy="2453843"/>
+            <wp:effectExtent l="0" t="0" r="0" b="0"/>
+            <wp:docPr id="10" name="Figure 4. Constructing the shoulder angle: (k₁, k₂) as the hand in the upper-arm frame, and θ₁ as the difference of two atan2 angles." descr="Figure 4. Constructing the shoulder angle: (k₁, k₂) as the hand in the upper-arm frame, and θ₁ as the difference of two atan2 angles." title="Figure 4. Constructing the shoulder angle: (k₁, k₂) as the hand in the upper-arm frame, and θ₁ as the difference of two atan2 angles."/>
+            <wp:cNvGraphicFramePr>
+              <a:graphicFrameLocks xmlns:a="http://schemas.openxmlformats.org/drawingml/2006/main" noChangeAspect="1"/>
+            </wp:cNvGraphicFramePr>
+            <a:graphic xmlns:a="http://schemas.openxmlformats.org/drawingml/2006/main">
+              <a:graphicData uri="http://schemas.openxmlformats.org/drawingml/2006/picture">
+                <pic:pic xmlns:pic="http://schemas.openxmlformats.org/drawingml/2006/picture">
+                  <pic:nvPicPr>
+                    <pic:cNvPr id="10" name="Figure 4. Constructing the shoulder angle: (k₁, k₂) as the hand in the upper-arm frame, and θ₁ as the difference of two atan2 angles." descr="Figure 4. Constructing the shoulder angle: (k₁, k₂) as the hand in the upper-arm frame, and θ₁ as the difference of two atan2 angles." title="Figure 4. Constructing the shoulder angle: (k₁, k₂) as the hand in the upper-arm frame, and θ₁ as the difference of two atan2 angles."/>
+                    <pic:cNvPicPr>
+                      <a:picLocks noChangeAspect="1" noChangeArrowheads="1"/>
+                    </pic:cNvPicPr>
+                  </pic:nvPicPr>
+                  <pic:blipFill>
+                    <a:blip r:embed="rId24"/>
+                    <a:stretch>
+                      <a:fillRect/>
+                    </a:stretch>
+                  </pic:blipFill>
+                  <pic:spPr bwMode="auto">
+                    <a:xfrm>
+                      <a:off x="0" y="0"/>
+                      <a:ext cx="5334000" cy="2453843"/>
+                    </a:xfrm>
+                    <a:prstGeom prst="rect">
+                      <a:avLst/>
+                    </a:prstGeom>
+                  </pic:spPr>
+                </pic:pic>
+              </a:graphicData>
+            </a:graphic>
+          </wp:inline>
+        </w:drawing>
+      </w:r>
+    </w:p>
+    <w:p>
+      <w:pPr>
+        <w:spacing w:after="200"/>
+        <w:jc w:val="center"/>
+      </w:pPr>
+      <w:r>
+        <w:rPr>
+          <w:i/>
+          <w:iCs/>
+          <w:color w:val="666666"/>
+          <w:sz w:val="20"/>
+          <w:szCs w:val="20"/>
+        </w:rPr>
+        <w:t xml:space="preserve">Figure 4. Constructing θ₁ (Equation 3.8). (a) The substitutions k₁ and k₂ are the hand’s coordinates in a frame aligned with the upper arm: k₁ is measured along the upper-arm axis and k₂ perpendicular to it, so √(k₁² + k₂²) recovers the shoulder-to-hand distance r. (b) The shoulder angle is then a difference of two angles: φ = atan2(y, x) is the direction from the shoulder to the target, and ψ = atan2(k₂, k₁) is the angle by which the forearm swings the hand off the upper-arm axis. Subtracting the second from the first leaves the absolute orientation of the upper arm, θ₁ = φ − ψ. Shown for θ₁ = 35°, θ₂ = 70°.</w:t>
       </w:r>
     </w:p>
     <w:tbl>
@@ -3244,15 +2462,7 @@
               <w:spacing w:after="160" w:line="300" w:lineRule="auto"/>
             </w:pPr>
             <w:r>
-              <w:t xml:space="preserve">The unconstrained IK problem yields two solutions for every interior workspace point. With our anatomical joint limits, only the elbow-flexion solution (θ₂ &gt; 0) is valid. On the workspace boundary (r = l₁ + l₂, where θ₂ = 0), there is exactly one solution—the arm is fully extended. The brain’s motor planning problem is simplified by joint </w:t>
-            </w:r>
-            <w:proofErr w:type="gramStart"/>
-            <w:r>
-              <w:t>limits, but</w:t>
-            </w:r>
-            <w:proofErr w:type="gramEnd"/>
-            <w:r>
-              <w:t xml:space="preserve"> not eliminated: even with a unique IK solution, the brain must still choose among infinitely many muscle activation patterns (the redundancy problem, Section 6).</w:t>
+              <w:t xml:space="preserve">The unconstrained IK problem yields two solutions for every interior workspace point. With our anatomical joint limits, only the elbow-flexion solution (θ₂ &gt; 0) is valid. On the workspace boundary (r = l₁ + l₂, where θ₂ = 0), there is exactly one solution—the arm is fully extended. The brain’s motor planning problem is simplified by joint limits, but not eliminated: even with a unique IK solution, the brain must still choose among infinitely many muscle activation patterns (the redundancy problem, Section 6).</w:t>
             </w:r>
           </w:p>
         </w:tc>
@@ -3265,13 +2475,8 @@
           <w:bottom w:val="single" w:sz="2" w:space="4" w:color="2E86AB"/>
         </w:pBdr>
       </w:pPr>
-      <w:proofErr w:type="gramStart"/>
-      <w:r>
-        <w:t>3.3  Geometric</w:t>
-      </w:r>
-      <w:proofErr w:type="gramEnd"/>
-      <w:r>
-        <w:t xml:space="preserve"> Intuition</w:t>
+      <w:r>
+        <w:t xml:space="preserve">3.3  Geometric Intuition</w:t>
       </w:r>
     </w:p>
     <w:p>
@@ -3304,7 +2509,7 @@
           <wp:inline distT="0" distB="0" distL="0" distR="0" wp14:anchorId="25179973" wp14:editId="1566933E">
             <wp:extent cx="4572000" cy="4000500"/>
             <wp:effectExtent l="0" t="0" r="0" b="0"/>
-            <wp:docPr id="4" name="Figure 4. IK as circle intersection. The valid solution (blue, θ₂ &gt; 0) and the invalid hyperextension solution (red, θ₂ &lt; 0) are shown." descr="Figure 4. IK as circle intersection. The valid solution (blue, θ₂ &gt; 0) and the invalid hyperextension solution (red, θ₂ &lt; 0) are shown." title="Figure 4. IK as circle intersection. The valid solution (blue, θ₂ &gt; 0) and the invalid hyperextension solution (red, θ₂ &lt; 0) are shown."/>
+            <wp:docPr id="4" name="Figure 5. IK as circle intersection. The valid solution (blue, θ₂ &gt; 0) and the invalid hyperextension solution (red, θ₂ &lt; 0) are shown." descr="Figure 5. IK as circle intersection. The valid solution (blue, θ₂ &gt; 0) and the invalid hyperextension solution (red, θ₂ &lt; 0) are shown." title="Figure 5. IK as circle intersection. The valid solution (blue, θ₂ &gt; 0) and the invalid hyperextension solution (red, θ₂ &lt; 0) are shown."/>
             <wp:cNvGraphicFramePr>
               <a:graphicFrameLocks xmlns:a="http://schemas.openxmlformats.org/drawingml/2006/main" noChangeAspect="1"/>
             </wp:cNvGraphicFramePr>
@@ -3312,7 +2517,7 @@
               <a:graphicData uri="http://schemas.openxmlformats.org/drawingml/2006/picture">
                 <pic:pic xmlns:pic="http://schemas.openxmlformats.org/drawingml/2006/picture">
                   <pic:nvPicPr>
-                    <pic:cNvPr id="4" name="Figure 4. IK as circle intersection. The valid solution (blue, θ₂ &gt; 0) and the invalid hyperextension solution (red, θ₂ &lt; 0) are shown." descr="Figure 4. IK as circle intersection. The valid solution (blue, θ₂ &gt; 0) and the invalid hyperextension solution (red, θ₂ &lt; 0) are shown." title="Figure 4. IK as circle intersection. The valid solution (blue, θ₂ &gt; 0) and the invalid hyperextension solution (red, θ₂ &lt; 0) are shown."/>
+                    <pic:cNvPr id="4" name="Figure 5. IK as circle intersection. The valid solution (blue, θ₂ &gt; 0) and the invalid hyperextension solution (red, θ₂ &lt; 0) are shown." descr="Figure 5. IK as circle intersection. The valid solution (blue, θ₂ &gt; 0) and the invalid hyperextension solution (red, θ₂ &lt; 0) are shown." title="Figure 5. IK as circle intersection. The valid solution (blue, θ₂ &gt; 0) and the invalid hyperextension solution (red, θ₂ &lt; 0) are shown."/>
                     <pic:cNvPicPr>
                       <a:picLocks noChangeAspect="1" noChangeArrowheads="1"/>
                     </pic:cNvPicPr>
@@ -3352,7 +2557,7 @@
           <w:sz w:val="20"/>
           <w:szCs w:val="20"/>
         </w:rPr>
-        <w:t>Figure 4. IK as circle intersection. The valid solution (blue, θ₂ &gt; 0) and the invalid hyperextension solution (red, θ₂ &lt; 0) are shown.</w:t>
+        <w:t>Figure 5. IK as circle intersection. The valid solution (blue, θ₂ &gt; 0) and the invalid hyperextension solution (red, θ₂ &lt; 0) are shown.</w:t>
       </w:r>
     </w:p>
     <w:p>
@@ -3369,7 +2574,7 @@
           <wp:inline distT="0" distB="0" distL="0" distR="0" wp14:anchorId="1B2B696C" wp14:editId="6B781B0A">
             <wp:extent cx="5334000" cy="2081318"/>
             <wp:effectExtent l="0" t="0" r="0" b="0"/>
-            <wp:docPr id="9" name="Figure 5. IK circle construction: two solutions, tangent case, and no intersection." descr="Figure 5. IK circle construction: two solutions, tangent case, and no intersection." title="Figure 5. IK circle construction: two solutions, tangent case, and no intersection."/>
+            <wp:docPr id="9" name="Figure 6. IK circle construction: two solutions, tangent case, and no intersection." descr="Figure 6. IK circle construction: two solutions, tangent case, and no intersection." title="Figure 6. IK circle construction: two solutions, tangent case, and no intersection."/>
             <wp:cNvGraphicFramePr>
               <a:graphicFrameLocks xmlns:a="http://schemas.openxmlformats.org/drawingml/2006/main" noChangeAspect="1"/>
             </wp:cNvGraphicFramePr>
@@ -3377,7 +2582,7 @@
               <a:graphicData uri="http://schemas.openxmlformats.org/drawingml/2006/picture">
                 <pic:pic xmlns:pic="http://schemas.openxmlformats.org/drawingml/2006/picture">
                   <pic:nvPicPr>
-                    <pic:cNvPr id="9" name="Figure 5. IK circle construction: two solutions, tangent case, and no intersection." descr="Figure 5. IK circle construction: two solutions, tangent case, and no intersection." title="Figure 5. IK circle construction: two solutions, tangent case, and no intersection."/>
+                    <pic:cNvPr id="9" name="Figure 6. IK circle construction: two solutions, tangent case, and no intersection." descr="Figure 6. IK circle construction: two solutions, tangent case, and no intersection." title="Figure 6. IK circle construction: two solutions, tangent case, and no intersection."/>
                     <pic:cNvPicPr>
                       <a:picLocks noChangeAspect="1" noChangeArrowheads="1"/>
                     </pic:cNvPicPr>
@@ -3417,7 +2622,7 @@
           <w:sz w:val="20"/>
           <w:szCs w:val="20"/>
         </w:rPr>
-        <w:t>Figure 5. Inverse kinematics as circle intersection, shown for three targets along a fixed direction (50°). (a) Interior target (r &lt; l₁ + l₂): the circles cross at two points, giving the valid elbow-flexion solution (blue, θ₂ = +60°) and the invalid hyperextension solution (red, θ₂ = −60°). (b) Target on the outer workspace boundary (r = l₁ + l₂ = 0.80 m): the circles are tangent, the two solutions merge into one, and the arm is fully extended (θ₂ = 0°) — precisely the configuration where det(J) = 0 (Section 4). (c) Target beyond the boundary (r &gt; l₁ + l₂): the circles do not intersect and the target is unreachable.</w:t>
+        <w:t>Figure 6. Inverse kinematics as circle intersection, shown for three targets along a fixed direction (50°). (a) Interior target (r &lt; l₁ + l₂): the circles cross at two points, giving the valid elbow-flexion solution (blue, θ₂ = +60°) and the invalid hyperextension solution (red, θ₂ = −60°). (b) Target on the outer workspace boundary (r = l₁ + l₂ = 0.80 m): the circles are tangent, the two solutions merge into one, and the arm is fully extended (θ₂ = 0°) — precisely the configuration where det(J) = 0 (Section 4). (c) Target beyond the boundary (r &gt; l₁ + l₂): the circles do not intersect and the target is unreachable.</w:t>
       </w:r>
     </w:p>
     <w:p>
@@ -3470,13 +2675,8 @@
           <w:bottom w:val="single" w:sz="2" w:space="4" w:color="2E86AB"/>
         </w:pBdr>
       </w:pPr>
-      <w:proofErr w:type="gramStart"/>
-      <w:r>
-        <w:t>4.1  Definition</w:t>
-      </w:r>
-      <w:proofErr w:type="gramEnd"/>
-      <w:r>
-        <w:t xml:space="preserve"> and Derivation</w:t>
+      <w:r>
+        <w:t xml:space="preserve">4.1  Definition and Derivation</w:t>
       </w:r>
     </w:p>
     <w:p>
@@ -3503,79 +2703,8 @@
           <w:sz w:val="24"/>
           <w:szCs w:val="24"/>
         </w:rPr>
-        <w:t>J = ∂f/∂q = [ ∂x/∂θ</w:t>
-      </w:r>
-      <w:proofErr w:type="gramStart"/>
-      <w:r>
-        <w:rPr>
-          <w:rFonts w:ascii="Cambria Math" w:eastAsia="Cambria Math" w:hAnsi="Cambria Math" w:cs="Cambria Math"/>
-          <w:color w:val="1B2A4A"/>
-          <w:sz w:val="24"/>
-          <w:szCs w:val="24"/>
-        </w:rPr>
-        <w:t>₁  ∂</w:t>
-      </w:r>
-      <w:proofErr w:type="gramEnd"/>
-      <w:r>
-        <w:rPr>
-          <w:rFonts w:ascii="Cambria Math" w:eastAsia="Cambria Math" w:hAnsi="Cambria Math" w:cs="Cambria Math"/>
-          <w:color w:val="1B2A4A"/>
-          <w:sz w:val="24"/>
-          <w:szCs w:val="24"/>
-        </w:rPr>
-        <w:t>x/∂θ</w:t>
-      </w:r>
-      <w:proofErr w:type="gramStart"/>
-      <w:r>
-        <w:rPr>
-          <w:rFonts w:ascii="Cambria Math" w:eastAsia="Cambria Math" w:hAnsi="Cambria Math" w:cs="Cambria Math"/>
-          <w:color w:val="1B2A4A"/>
-          <w:sz w:val="24"/>
-          <w:szCs w:val="24"/>
-        </w:rPr>
-        <w:t>₂ ;</w:t>
-      </w:r>
-      <w:proofErr w:type="gramEnd"/>
-      <w:r>
-        <w:rPr>
-          <w:rFonts w:ascii="Cambria Math" w:eastAsia="Cambria Math" w:hAnsi="Cambria Math" w:cs="Cambria Math"/>
-          <w:color w:val="1B2A4A"/>
-          <w:sz w:val="24"/>
-          <w:szCs w:val="24"/>
-        </w:rPr>
-        <w:t xml:space="preserve">  ∂y/∂θ</w:t>
-      </w:r>
-      <w:proofErr w:type="gramStart"/>
-      <w:r>
-        <w:rPr>
-          <w:rFonts w:ascii="Cambria Math" w:eastAsia="Cambria Math" w:hAnsi="Cambria Math" w:cs="Cambria Math"/>
-          <w:color w:val="1B2A4A"/>
-          <w:sz w:val="24"/>
-          <w:szCs w:val="24"/>
-        </w:rPr>
-        <w:t>₁  ∂</w:t>
-      </w:r>
-      <w:proofErr w:type="gramEnd"/>
-      <w:r>
-        <w:rPr>
-          <w:rFonts w:ascii="Cambria Math" w:eastAsia="Cambria Math" w:hAnsi="Cambria Math" w:cs="Cambria Math"/>
-          <w:color w:val="1B2A4A"/>
-          <w:sz w:val="24"/>
-          <w:szCs w:val="24"/>
-        </w:rPr>
-        <w:t>y/∂θ</w:t>
-      </w:r>
-      <w:proofErr w:type="gramStart"/>
-      <w:r>
-        <w:rPr>
-          <w:rFonts w:ascii="Cambria Math" w:eastAsia="Cambria Math" w:hAnsi="Cambria Math" w:cs="Cambria Math"/>
-          <w:color w:val="1B2A4A"/>
-          <w:sz w:val="24"/>
-          <w:szCs w:val="24"/>
-        </w:rPr>
-        <w:t>₂ ]</w:t>
-      </w:r>
-      <w:proofErr w:type="gramEnd"/>
+        <w:t xml:space="preserve">J = ∂f/∂q = [ ∂x/∂θ₁  ∂x/∂θ₂ ;  ∂y/∂θ₁  ∂y/∂θ₂ ]</w:t>
+      </w:r>
       <w:r>
         <w:rPr>
           <w:color w:val="666666"/>
@@ -3603,7 +2732,6 @@
         <w:ind w:left="720"/>
         <w:jc w:val="center"/>
       </w:pPr>
-      <w:proofErr w:type="spellStart"/>
       <w:r>
         <w:rPr>
           <w:rFonts w:ascii="Cambria Math" w:eastAsia="Cambria Math" w:hAnsi="Cambria Math" w:cs="Cambria Math"/>
@@ -3611,37 +2739,7 @@
           <w:sz w:val="24"/>
           <w:szCs w:val="24"/>
         </w:rPr>
-        <w:t>dp</w:t>
-      </w:r>
-      <w:proofErr w:type="spellEnd"/>
-      <w:r>
-        <w:rPr>
-          <w:rFonts w:ascii="Cambria Math" w:eastAsia="Cambria Math" w:hAnsi="Cambria Math" w:cs="Cambria Math"/>
-          <w:color w:val="1B2A4A"/>
-          <w:sz w:val="24"/>
-          <w:szCs w:val="24"/>
-        </w:rPr>
-        <w:t xml:space="preserve"> = J · </w:t>
-      </w:r>
-      <w:proofErr w:type="spellStart"/>
-      <w:r>
-        <w:rPr>
-          <w:rFonts w:ascii="Cambria Math" w:eastAsia="Cambria Math" w:hAnsi="Cambria Math" w:cs="Cambria Math"/>
-          <w:color w:val="1B2A4A"/>
-          <w:sz w:val="24"/>
-          <w:szCs w:val="24"/>
-        </w:rPr>
-        <w:t>dq</w:t>
-      </w:r>
-      <w:proofErr w:type="spellEnd"/>
-      <w:r>
-        <w:rPr>
-          <w:rFonts w:ascii="Cambria Math" w:eastAsia="Cambria Math" w:hAnsi="Cambria Math" w:cs="Cambria Math"/>
-          <w:color w:val="1B2A4A"/>
-          <w:sz w:val="24"/>
-          <w:szCs w:val="24"/>
-        </w:rPr>
-        <w:t xml:space="preserve">    equivalently:    ṗ = J · θ̇</w:t>
+        <w:t xml:space="preserve">dp = J · dq    equivalently:    ṗ = J · θ̇</w:t>
       </w:r>
       <w:r>
         <w:rPr>
@@ -3699,27 +2797,7 @@
           <w:sz w:val="24"/>
           <w:szCs w:val="24"/>
         </w:rPr>
-        <w:t xml:space="preserve">∂x/∂θ₁ = −l₁ sin(θ₁) − l₂ </w:t>
-      </w:r>
-      <w:proofErr w:type="gramStart"/>
-      <w:r>
-        <w:rPr>
-          <w:rFonts w:ascii="Cambria Math" w:eastAsia="Cambria Math" w:hAnsi="Cambria Math" w:cs="Cambria Math"/>
-          <w:color w:val="1B2A4A"/>
-          <w:sz w:val="24"/>
-          <w:szCs w:val="24"/>
-        </w:rPr>
-        <w:t>sin(</w:t>
-      </w:r>
-      <w:proofErr w:type="gramEnd"/>
-      <w:r>
-        <w:rPr>
-          <w:rFonts w:ascii="Cambria Math" w:eastAsia="Cambria Math" w:hAnsi="Cambria Math" w:cs="Cambria Math"/>
-          <w:color w:val="1B2A4A"/>
-          <w:sz w:val="24"/>
-          <w:szCs w:val="24"/>
-        </w:rPr>
-        <w:t>θ₁ + θ₂)</w:t>
+        <w:t xml:space="preserve">∂x/∂θ₁ = −l₁ sin(θ₁) − l₂ sin(θ₁ + θ₂)</w:t>
       </w:r>
       <w:r>
         <w:rPr>
@@ -3761,27 +2839,7 @@
           <w:sz w:val="24"/>
           <w:szCs w:val="24"/>
         </w:rPr>
-        <w:t xml:space="preserve">∂x/∂θ₂ = −l₂ </w:t>
-      </w:r>
-      <w:proofErr w:type="gramStart"/>
-      <w:r>
-        <w:rPr>
-          <w:rFonts w:ascii="Cambria Math" w:eastAsia="Cambria Math" w:hAnsi="Cambria Math" w:cs="Cambria Math"/>
-          <w:color w:val="1B2A4A"/>
-          <w:sz w:val="24"/>
-          <w:szCs w:val="24"/>
-        </w:rPr>
-        <w:t>sin(</w:t>
-      </w:r>
-      <w:proofErr w:type="gramEnd"/>
-      <w:r>
-        <w:rPr>
-          <w:rFonts w:ascii="Cambria Math" w:eastAsia="Cambria Math" w:hAnsi="Cambria Math" w:cs="Cambria Math"/>
-          <w:color w:val="1B2A4A"/>
-          <w:sz w:val="24"/>
-          <w:szCs w:val="24"/>
-        </w:rPr>
-        <w:t>θ₁ + θ₂)</w:t>
+        <w:t xml:space="preserve">∂x/∂θ₂ = −l₂ sin(θ₁ + θ₂)</w:t>
       </w:r>
       <w:r>
         <w:rPr>
@@ -3823,27 +2881,7 @@
           <w:sz w:val="24"/>
           <w:szCs w:val="24"/>
         </w:rPr>
-        <w:t xml:space="preserve">∂y/∂θ₁ = l₁ cos(θ₁) + l₂ </w:t>
-      </w:r>
-      <w:proofErr w:type="gramStart"/>
-      <w:r>
-        <w:rPr>
-          <w:rFonts w:ascii="Cambria Math" w:eastAsia="Cambria Math" w:hAnsi="Cambria Math" w:cs="Cambria Math"/>
-          <w:color w:val="1B2A4A"/>
-          <w:sz w:val="24"/>
-          <w:szCs w:val="24"/>
-        </w:rPr>
-        <w:t>cos(</w:t>
-      </w:r>
-      <w:proofErr w:type="gramEnd"/>
-      <w:r>
-        <w:rPr>
-          <w:rFonts w:ascii="Cambria Math" w:eastAsia="Cambria Math" w:hAnsi="Cambria Math" w:cs="Cambria Math"/>
-          <w:color w:val="1B2A4A"/>
-          <w:sz w:val="24"/>
-          <w:szCs w:val="24"/>
-        </w:rPr>
-        <w:t>θ₁ + θ₂)</w:t>
+        <w:t xml:space="preserve">∂y/∂θ₁ = l₁ cos(θ₁) + l₂ cos(θ₁ + θ₂)</w:t>
       </w:r>
       <w:r>
         <w:rPr>
@@ -3885,27 +2923,7 @@
           <w:sz w:val="24"/>
           <w:szCs w:val="24"/>
         </w:rPr>
-        <w:t xml:space="preserve">∂y/∂θ₂ = l₂ </w:t>
-      </w:r>
-      <w:proofErr w:type="gramStart"/>
-      <w:r>
-        <w:rPr>
-          <w:rFonts w:ascii="Cambria Math" w:eastAsia="Cambria Math" w:hAnsi="Cambria Math" w:cs="Cambria Math"/>
-          <w:color w:val="1B2A4A"/>
-          <w:sz w:val="24"/>
-          <w:szCs w:val="24"/>
-        </w:rPr>
-        <w:t>cos(</w:t>
-      </w:r>
-      <w:proofErr w:type="gramEnd"/>
-      <w:r>
-        <w:rPr>
-          <w:rFonts w:ascii="Cambria Math" w:eastAsia="Cambria Math" w:hAnsi="Cambria Math" w:cs="Cambria Math"/>
-          <w:color w:val="1B2A4A"/>
-          <w:sz w:val="24"/>
-          <w:szCs w:val="24"/>
-        </w:rPr>
-        <w:t>θ₁ + θ₂)</w:t>
+        <w:t xml:space="preserve">∂y/∂θ₂ = l₂ cos(θ₁ + θ₂)</w:t>
       </w:r>
       <w:r>
         <w:rPr>
@@ -3941,9 +2959,63 @@
           <w:sz w:val="24"/>
           <w:szCs w:val="24"/>
         </w:rPr>
-        <w:t>J = [ −</w:t>
-      </w:r>
-      <w:proofErr w:type="spellStart"/>
+        <w:t xml:space="preserve">J = [ −l₁s₁ − l₂s₁₂    −l₂s₁₂ ;   l₁c₁ + l₂c₁₂    l₂c₁₂ ]</w:t>
+      </w:r>
+      <w:r>
+        <w:rPr>
+          <w:color w:val="666666"/>
+          <w:sz w:val="20"/>
+          <w:szCs w:val="20"/>
+        </w:rPr>
+        <w:tab/>
+        <w:t>(4.4)</w:t>
+      </w:r>
+    </w:p>
+    <w:p>
+      <w:pPr>
+        <w:spacing w:after="160" w:line="300" w:lineRule="auto"/>
+      </w:pPr>
+      <w:r>
+        <w:t xml:space="preserve">where we use the shorthand s₁ = sin(θ₁), c₁ = cos(θ₁), s₁₂ = sin(θ₁ + θ₂), c₁₂ = cos(θ₁ + θ₂).</w:t>
+      </w:r>
+    </w:p>
+    <w:p>
+      <w:pPr>
+        <w:pStyle w:val="Heading2"/>
+        <w:pBdr>
+          <w:bottom w:val="single" w:sz="2" w:space="4" w:color="2E86AB"/>
+        </w:pBdr>
+      </w:pPr>
+      <w:r>
+        <w:t xml:space="preserve">4.2  The Determinant and Singularities</w:t>
+      </w:r>
+    </w:p>
+    <w:p>
+      <w:pPr>
+        <w:spacing w:after="160" w:line="300" w:lineRule="auto"/>
+      </w:pPr>
+      <w:r>
+        <w:t xml:space="preserve">When det(J) = 0, the two columns of J become parallel, meaning both joint velocities produce endpoint motion in the </w:t>
+      </w:r>
+      <w:r>
+        <w:rPr>
+          <w:i/>
+          <w:iCs/>
+        </w:rPr>
+        <w:t>same</w:t>
+      </w:r>
+      <w:r>
+        <w:t xml:space="preserve"> direction. The arm can still move along that direction, but motion in the perpendicular direction becomes impossible—the arm has lost one of its two task-space </w:t>
+        <w:lastRenderedPageBreak/>
+        <w:t>degrees of freedom. To see when this happens, we compute the determinant of the matrix in Equation 4.4. Expanding the 2×2 determinant:</w:t>
+      </w:r>
+    </w:p>
+    <w:p>
+      <w:pPr>
+        <w:spacing w:before="200" w:after="200"/>
+        <w:ind w:left="720"/>
+        <w:jc w:val="center"/>
+      </w:pPr>
       <w:r>
         <w:rPr>
           <w:rFonts w:ascii="Cambria Math" w:eastAsia="Cambria Math" w:hAnsi="Cambria Math" w:cs="Cambria Math"/>
@@ -3951,9 +3023,23 @@
           <w:sz w:val="24"/>
           <w:szCs w:val="24"/>
         </w:rPr>
-        <w:t>l₁s</w:t>
-      </w:r>
-      <w:proofErr w:type="spellEnd"/>
+        <w:t xml:space="preserve">det(J) = (−l₁s₁ − l₂s₁₂)(l₂c₁₂) − (−l₂s₁₂)(l₁c₁ + l₂c₁₂)</w:t>
+      </w:r>
+    </w:p>
+    <w:p>
+      <w:pPr>
+        <w:spacing w:after="160" w:line="300" w:lineRule="auto"/>
+      </w:pPr>
+      <w:r>
+        <w:t>Expanding and simplifying:</w:t>
+      </w:r>
+    </w:p>
+    <w:p>
+      <w:pPr>
+        <w:spacing w:before="200" w:after="200"/>
+        <w:ind w:left="720"/>
+        <w:jc w:val="center"/>
+      </w:pPr>
       <w:r>
         <w:rPr>
           <w:rFonts w:ascii="Cambria Math" w:eastAsia="Cambria Math" w:hAnsi="Cambria Math" w:cs="Cambria Math"/>
@@ -3961,9 +3047,23 @@
           <w:sz w:val="24"/>
           <w:szCs w:val="24"/>
         </w:rPr>
-        <w:t xml:space="preserve">₁ − </w:t>
-      </w:r>
-      <w:proofErr w:type="spellStart"/>
+        <w:t xml:space="preserve">= −l₁l₂s₁c₁₂ − l₂²s₁₂c₁₂ + l₁l₂s₁₂c₁ + l₂²s₁₂c₁₂</w:t>
+      </w:r>
+    </w:p>
+    <w:p>
+      <w:pPr>
+        <w:spacing w:after="160" w:line="300" w:lineRule="auto"/>
+      </w:pPr>
+      <w:r>
+        <w:t>The l₂² terms cancel, leaving:</w:t>
+      </w:r>
+    </w:p>
+    <w:p>
+      <w:pPr>
+        <w:spacing w:before="200" w:after="200"/>
+        <w:ind w:left="720"/>
+        <w:jc w:val="center"/>
+      </w:pPr>
       <w:r>
         <w:rPr>
           <w:rFonts w:ascii="Cambria Math" w:eastAsia="Cambria Math" w:hAnsi="Cambria Math" w:cs="Cambria Math"/>
@@ -3971,556 +3071,7 @@
           <w:sz w:val="24"/>
           <w:szCs w:val="24"/>
         </w:rPr>
-        <w:t>l₂s</w:t>
-      </w:r>
-      <w:proofErr w:type="spellEnd"/>
-      <w:r>
-        <w:rPr>
-          <w:rFonts w:ascii="Cambria Math" w:eastAsia="Cambria Math" w:hAnsi="Cambria Math" w:cs="Cambria Math"/>
-          <w:color w:val="1B2A4A"/>
-          <w:sz w:val="24"/>
-          <w:szCs w:val="24"/>
-        </w:rPr>
-        <w:t>₁₂    −</w:t>
-      </w:r>
-      <w:proofErr w:type="spellStart"/>
-      <w:r>
-        <w:rPr>
-          <w:rFonts w:ascii="Cambria Math" w:eastAsia="Cambria Math" w:hAnsi="Cambria Math" w:cs="Cambria Math"/>
-          <w:color w:val="1B2A4A"/>
-          <w:sz w:val="24"/>
-          <w:szCs w:val="24"/>
-        </w:rPr>
-        <w:t>l₂s</w:t>
-      </w:r>
-      <w:proofErr w:type="spellEnd"/>
-      <w:r>
-        <w:rPr>
-          <w:rFonts w:ascii="Cambria Math" w:eastAsia="Cambria Math" w:hAnsi="Cambria Math" w:cs="Cambria Math"/>
-          <w:color w:val="1B2A4A"/>
-          <w:sz w:val="24"/>
-          <w:szCs w:val="24"/>
-        </w:rPr>
-        <w:t>₁</w:t>
-      </w:r>
-      <w:proofErr w:type="gramStart"/>
-      <w:r>
-        <w:rPr>
-          <w:rFonts w:ascii="Cambria Math" w:eastAsia="Cambria Math" w:hAnsi="Cambria Math" w:cs="Cambria Math"/>
-          <w:color w:val="1B2A4A"/>
-          <w:sz w:val="24"/>
-          <w:szCs w:val="24"/>
-        </w:rPr>
-        <w:t>₂ ;</w:t>
-      </w:r>
-      <w:proofErr w:type="gramEnd"/>
-      <w:r>
-        <w:rPr>
-          <w:rFonts w:ascii="Cambria Math" w:eastAsia="Cambria Math" w:hAnsi="Cambria Math" w:cs="Cambria Math"/>
-          <w:color w:val="1B2A4A"/>
-          <w:sz w:val="24"/>
-          <w:szCs w:val="24"/>
-        </w:rPr>
-        <w:t xml:space="preserve">   </w:t>
-      </w:r>
-      <w:proofErr w:type="spellStart"/>
-      <w:r>
-        <w:rPr>
-          <w:rFonts w:ascii="Cambria Math" w:eastAsia="Cambria Math" w:hAnsi="Cambria Math" w:cs="Cambria Math"/>
-          <w:color w:val="1B2A4A"/>
-          <w:sz w:val="24"/>
-          <w:szCs w:val="24"/>
-        </w:rPr>
-        <w:t>l₁c</w:t>
-      </w:r>
-      <w:proofErr w:type="spellEnd"/>
-      <w:r>
-        <w:rPr>
-          <w:rFonts w:ascii="Cambria Math" w:eastAsia="Cambria Math" w:hAnsi="Cambria Math" w:cs="Cambria Math"/>
-          <w:color w:val="1B2A4A"/>
-          <w:sz w:val="24"/>
-          <w:szCs w:val="24"/>
-        </w:rPr>
-        <w:t xml:space="preserve">₁ + </w:t>
-      </w:r>
-      <w:proofErr w:type="spellStart"/>
-      <w:r>
-        <w:rPr>
-          <w:rFonts w:ascii="Cambria Math" w:eastAsia="Cambria Math" w:hAnsi="Cambria Math" w:cs="Cambria Math"/>
-          <w:color w:val="1B2A4A"/>
-          <w:sz w:val="24"/>
-          <w:szCs w:val="24"/>
-        </w:rPr>
-        <w:t>l₂c</w:t>
-      </w:r>
-      <w:proofErr w:type="spellEnd"/>
-      <w:r>
-        <w:rPr>
-          <w:rFonts w:ascii="Cambria Math" w:eastAsia="Cambria Math" w:hAnsi="Cambria Math" w:cs="Cambria Math"/>
-          <w:color w:val="1B2A4A"/>
-          <w:sz w:val="24"/>
-          <w:szCs w:val="24"/>
-        </w:rPr>
-        <w:t xml:space="preserve">₁₂    </w:t>
-      </w:r>
-      <w:proofErr w:type="spellStart"/>
-      <w:r>
-        <w:rPr>
-          <w:rFonts w:ascii="Cambria Math" w:eastAsia="Cambria Math" w:hAnsi="Cambria Math" w:cs="Cambria Math"/>
-          <w:color w:val="1B2A4A"/>
-          <w:sz w:val="24"/>
-          <w:szCs w:val="24"/>
-        </w:rPr>
-        <w:t>l₂c</w:t>
-      </w:r>
-      <w:proofErr w:type="spellEnd"/>
-      <w:r>
-        <w:rPr>
-          <w:rFonts w:ascii="Cambria Math" w:eastAsia="Cambria Math" w:hAnsi="Cambria Math" w:cs="Cambria Math"/>
-          <w:color w:val="1B2A4A"/>
-          <w:sz w:val="24"/>
-          <w:szCs w:val="24"/>
-        </w:rPr>
-        <w:t>₁</w:t>
-      </w:r>
-      <w:proofErr w:type="gramStart"/>
-      <w:r>
-        <w:rPr>
-          <w:rFonts w:ascii="Cambria Math" w:eastAsia="Cambria Math" w:hAnsi="Cambria Math" w:cs="Cambria Math"/>
-          <w:color w:val="1B2A4A"/>
-          <w:sz w:val="24"/>
-          <w:szCs w:val="24"/>
-        </w:rPr>
-        <w:t>₂ ]</w:t>
-      </w:r>
-      <w:proofErr w:type="gramEnd"/>
-      <w:r>
-        <w:rPr>
-          <w:color w:val="666666"/>
-          <w:sz w:val="20"/>
-          <w:szCs w:val="20"/>
-        </w:rPr>
-        <w:tab/>
-        <w:t>(4.4)</w:t>
-      </w:r>
-    </w:p>
-    <w:p>
-      <w:pPr>
-        <w:spacing w:after="160" w:line="300" w:lineRule="auto"/>
-      </w:pPr>
-      <w:r>
-        <w:t xml:space="preserve">where we use the shorthand s₁ = sin(θ₁), c₁ = cos(θ₁), s₁₂ = </w:t>
-      </w:r>
-      <w:proofErr w:type="gramStart"/>
-      <w:r>
-        <w:t>sin(</w:t>
-      </w:r>
-      <w:proofErr w:type="gramEnd"/>
-      <w:r>
-        <w:t xml:space="preserve">θ₁ + θ₂), c₁₂ = </w:t>
-      </w:r>
-      <w:proofErr w:type="gramStart"/>
-      <w:r>
-        <w:t>cos(</w:t>
-      </w:r>
-      <w:proofErr w:type="gramEnd"/>
-      <w:r>
-        <w:t>θ₁ + θ₂).</w:t>
-      </w:r>
-    </w:p>
-    <w:p>
-      <w:pPr>
-        <w:pStyle w:val="Heading2"/>
-        <w:pBdr>
-          <w:bottom w:val="single" w:sz="2" w:space="4" w:color="2E86AB"/>
-        </w:pBdr>
-      </w:pPr>
-      <w:proofErr w:type="gramStart"/>
-      <w:r>
-        <w:t>4.2  The</w:t>
-      </w:r>
-      <w:proofErr w:type="gramEnd"/>
-      <w:r>
-        <w:t xml:space="preserve"> Determinant and Singularities</w:t>
-      </w:r>
-    </w:p>
-    <w:p>
-      <w:pPr>
-        <w:spacing w:after="160" w:line="300" w:lineRule="auto"/>
-      </w:pPr>
-      <w:r>
-        <w:t xml:space="preserve">When det(J) = 0, the two columns of J become parallel, meaning both joint velocities produce endpoint motion in the </w:t>
-      </w:r>
-      <w:r>
-        <w:rPr>
-          <w:i/>
-          <w:iCs/>
-        </w:rPr>
-        <w:t>same</w:t>
-      </w:r>
-      <w:r>
-        <w:t xml:space="preserve"> direction. The arm can still move along that direction, but motion in the perpendicular direction becomes impossible—the arm has lost one of its two task-space </w:t>
-      </w:r>
-      <w:r>
-        <w:lastRenderedPageBreak/>
-        <w:t>degrees of freedom. To see when this happens, we compute the determinant of the matrix in Equation 4.4. Expanding the 2×2 determinant:</w:t>
-      </w:r>
-    </w:p>
-    <w:p>
-      <w:pPr>
-        <w:spacing w:before="200" w:after="200"/>
-        <w:ind w:left="720"/>
-        <w:jc w:val="center"/>
-      </w:pPr>
-      <w:r>
-        <w:rPr>
-          <w:rFonts w:ascii="Cambria Math" w:eastAsia="Cambria Math" w:hAnsi="Cambria Math" w:cs="Cambria Math"/>
-          <w:color w:val="1B2A4A"/>
-          <w:sz w:val="24"/>
-          <w:szCs w:val="24"/>
-        </w:rPr>
-        <w:t>det(J) = (−</w:t>
-      </w:r>
-      <w:proofErr w:type="spellStart"/>
-      <w:r>
-        <w:rPr>
-          <w:rFonts w:ascii="Cambria Math" w:eastAsia="Cambria Math" w:hAnsi="Cambria Math" w:cs="Cambria Math"/>
-          <w:color w:val="1B2A4A"/>
-          <w:sz w:val="24"/>
-          <w:szCs w:val="24"/>
-        </w:rPr>
-        <w:t>l₁s</w:t>
-      </w:r>
-      <w:proofErr w:type="spellEnd"/>
-      <w:r>
-        <w:rPr>
-          <w:rFonts w:ascii="Cambria Math" w:eastAsia="Cambria Math" w:hAnsi="Cambria Math" w:cs="Cambria Math"/>
-          <w:color w:val="1B2A4A"/>
-          <w:sz w:val="24"/>
-          <w:szCs w:val="24"/>
-        </w:rPr>
-        <w:t xml:space="preserve">₁ − </w:t>
-      </w:r>
-      <w:proofErr w:type="spellStart"/>
-      <w:r>
-        <w:rPr>
-          <w:rFonts w:ascii="Cambria Math" w:eastAsia="Cambria Math" w:hAnsi="Cambria Math" w:cs="Cambria Math"/>
-          <w:color w:val="1B2A4A"/>
-          <w:sz w:val="24"/>
-          <w:szCs w:val="24"/>
-        </w:rPr>
-        <w:t>l₂s</w:t>
-      </w:r>
-      <w:proofErr w:type="spellEnd"/>
-      <w:r>
-        <w:rPr>
-          <w:rFonts w:ascii="Cambria Math" w:eastAsia="Cambria Math" w:hAnsi="Cambria Math" w:cs="Cambria Math"/>
-          <w:color w:val="1B2A4A"/>
-          <w:sz w:val="24"/>
-          <w:szCs w:val="24"/>
-        </w:rPr>
-        <w:t>₁</w:t>
-      </w:r>
-      <w:proofErr w:type="gramStart"/>
-      <w:r>
-        <w:rPr>
-          <w:rFonts w:ascii="Cambria Math" w:eastAsia="Cambria Math" w:hAnsi="Cambria Math" w:cs="Cambria Math"/>
-          <w:color w:val="1B2A4A"/>
-          <w:sz w:val="24"/>
-          <w:szCs w:val="24"/>
-        </w:rPr>
-        <w:t>₂)(</w:t>
-      </w:r>
-      <w:proofErr w:type="spellStart"/>
-      <w:proofErr w:type="gramEnd"/>
-      <w:r>
-        <w:rPr>
-          <w:rFonts w:ascii="Cambria Math" w:eastAsia="Cambria Math" w:hAnsi="Cambria Math" w:cs="Cambria Math"/>
-          <w:color w:val="1B2A4A"/>
-          <w:sz w:val="24"/>
-          <w:szCs w:val="24"/>
-        </w:rPr>
-        <w:t>l₂c</w:t>
-      </w:r>
-      <w:proofErr w:type="spellEnd"/>
-      <w:r>
-        <w:rPr>
-          <w:rFonts w:ascii="Cambria Math" w:eastAsia="Cambria Math" w:hAnsi="Cambria Math" w:cs="Cambria Math"/>
-          <w:color w:val="1B2A4A"/>
-          <w:sz w:val="24"/>
-          <w:szCs w:val="24"/>
-        </w:rPr>
-        <w:t>₁₂) − (−</w:t>
-      </w:r>
-      <w:proofErr w:type="spellStart"/>
-      <w:r>
-        <w:rPr>
-          <w:rFonts w:ascii="Cambria Math" w:eastAsia="Cambria Math" w:hAnsi="Cambria Math" w:cs="Cambria Math"/>
-          <w:color w:val="1B2A4A"/>
-          <w:sz w:val="24"/>
-          <w:szCs w:val="24"/>
-        </w:rPr>
-        <w:t>l₂s</w:t>
-      </w:r>
-      <w:proofErr w:type="spellEnd"/>
-      <w:r>
-        <w:rPr>
-          <w:rFonts w:ascii="Cambria Math" w:eastAsia="Cambria Math" w:hAnsi="Cambria Math" w:cs="Cambria Math"/>
-          <w:color w:val="1B2A4A"/>
-          <w:sz w:val="24"/>
-          <w:szCs w:val="24"/>
-        </w:rPr>
-        <w:t>₁</w:t>
-      </w:r>
-      <w:proofErr w:type="gramStart"/>
-      <w:r>
-        <w:rPr>
-          <w:rFonts w:ascii="Cambria Math" w:eastAsia="Cambria Math" w:hAnsi="Cambria Math" w:cs="Cambria Math"/>
-          <w:color w:val="1B2A4A"/>
-          <w:sz w:val="24"/>
-          <w:szCs w:val="24"/>
-        </w:rPr>
-        <w:t>₂)(</w:t>
-      </w:r>
-      <w:proofErr w:type="spellStart"/>
-      <w:proofErr w:type="gramEnd"/>
-      <w:r>
-        <w:rPr>
-          <w:rFonts w:ascii="Cambria Math" w:eastAsia="Cambria Math" w:hAnsi="Cambria Math" w:cs="Cambria Math"/>
-          <w:color w:val="1B2A4A"/>
-          <w:sz w:val="24"/>
-          <w:szCs w:val="24"/>
-        </w:rPr>
-        <w:t>l₁c</w:t>
-      </w:r>
-      <w:proofErr w:type="spellEnd"/>
-      <w:r>
-        <w:rPr>
-          <w:rFonts w:ascii="Cambria Math" w:eastAsia="Cambria Math" w:hAnsi="Cambria Math" w:cs="Cambria Math"/>
-          <w:color w:val="1B2A4A"/>
-          <w:sz w:val="24"/>
-          <w:szCs w:val="24"/>
-        </w:rPr>
-        <w:t xml:space="preserve">₁ + </w:t>
-      </w:r>
-      <w:proofErr w:type="spellStart"/>
-      <w:r>
-        <w:rPr>
-          <w:rFonts w:ascii="Cambria Math" w:eastAsia="Cambria Math" w:hAnsi="Cambria Math" w:cs="Cambria Math"/>
-          <w:color w:val="1B2A4A"/>
-          <w:sz w:val="24"/>
-          <w:szCs w:val="24"/>
-        </w:rPr>
-        <w:t>l₂c</w:t>
-      </w:r>
-      <w:proofErr w:type="spellEnd"/>
-      <w:r>
-        <w:rPr>
-          <w:rFonts w:ascii="Cambria Math" w:eastAsia="Cambria Math" w:hAnsi="Cambria Math" w:cs="Cambria Math"/>
-          <w:color w:val="1B2A4A"/>
-          <w:sz w:val="24"/>
-          <w:szCs w:val="24"/>
-        </w:rPr>
-        <w:t>₁₂)</w:t>
-      </w:r>
-    </w:p>
-    <w:p>
-      <w:pPr>
-        <w:spacing w:after="160" w:line="300" w:lineRule="auto"/>
-      </w:pPr>
-      <w:r>
-        <w:t>Expanding and simplifying:</w:t>
-      </w:r>
-    </w:p>
-    <w:p>
-      <w:pPr>
-        <w:spacing w:before="200" w:after="200"/>
-        <w:ind w:left="720"/>
-        <w:jc w:val="center"/>
-      </w:pPr>
-      <w:r>
-        <w:rPr>
-          <w:rFonts w:ascii="Cambria Math" w:eastAsia="Cambria Math" w:hAnsi="Cambria Math" w:cs="Cambria Math"/>
-          <w:color w:val="1B2A4A"/>
-          <w:sz w:val="24"/>
-          <w:szCs w:val="24"/>
-        </w:rPr>
-        <w:t>= −</w:t>
-      </w:r>
-      <w:proofErr w:type="spellStart"/>
-      <w:r>
-        <w:rPr>
-          <w:rFonts w:ascii="Cambria Math" w:eastAsia="Cambria Math" w:hAnsi="Cambria Math" w:cs="Cambria Math"/>
-          <w:color w:val="1B2A4A"/>
-          <w:sz w:val="24"/>
-          <w:szCs w:val="24"/>
-        </w:rPr>
-        <w:t>l₁l₂s₁c</w:t>
-      </w:r>
-      <w:proofErr w:type="spellEnd"/>
-      <w:r>
-        <w:rPr>
-          <w:rFonts w:ascii="Cambria Math" w:eastAsia="Cambria Math" w:hAnsi="Cambria Math" w:cs="Cambria Math"/>
-          <w:color w:val="1B2A4A"/>
-          <w:sz w:val="24"/>
-          <w:szCs w:val="24"/>
-        </w:rPr>
-        <w:t xml:space="preserve">₁₂ − l₂²s₁₂c₁₂ + </w:t>
-      </w:r>
-      <w:proofErr w:type="spellStart"/>
-      <w:r>
-        <w:rPr>
-          <w:rFonts w:ascii="Cambria Math" w:eastAsia="Cambria Math" w:hAnsi="Cambria Math" w:cs="Cambria Math"/>
-          <w:color w:val="1B2A4A"/>
-          <w:sz w:val="24"/>
-          <w:szCs w:val="24"/>
-        </w:rPr>
-        <w:t>l₁l₂s</w:t>
-      </w:r>
-      <w:proofErr w:type="spellEnd"/>
-      <w:r>
-        <w:rPr>
-          <w:rFonts w:ascii="Cambria Math" w:eastAsia="Cambria Math" w:hAnsi="Cambria Math" w:cs="Cambria Math"/>
-          <w:color w:val="1B2A4A"/>
-          <w:sz w:val="24"/>
-          <w:szCs w:val="24"/>
-        </w:rPr>
-        <w:t>₁₂c₁ + l₂²s₁₂c₁₂</w:t>
-      </w:r>
-    </w:p>
-    <w:p>
-      <w:pPr>
-        <w:spacing w:after="160" w:line="300" w:lineRule="auto"/>
-      </w:pPr>
-      <w:r>
-        <w:t>The l₂² terms cancel, leaving:</w:t>
-      </w:r>
-    </w:p>
-    <w:p>
-      <w:pPr>
-        <w:spacing w:before="200" w:after="200"/>
-        <w:ind w:left="720"/>
-        <w:jc w:val="center"/>
-      </w:pPr>
-      <w:r>
-        <w:rPr>
-          <w:rFonts w:ascii="Cambria Math" w:eastAsia="Cambria Math" w:hAnsi="Cambria Math" w:cs="Cambria Math"/>
-          <w:color w:val="1B2A4A"/>
-          <w:sz w:val="24"/>
-          <w:szCs w:val="24"/>
-        </w:rPr>
-        <w:t xml:space="preserve">= </w:t>
-      </w:r>
-      <w:proofErr w:type="spellStart"/>
-      <w:r>
-        <w:rPr>
-          <w:rFonts w:ascii="Cambria Math" w:eastAsia="Cambria Math" w:hAnsi="Cambria Math" w:cs="Cambria Math"/>
-          <w:color w:val="1B2A4A"/>
-          <w:sz w:val="24"/>
-          <w:szCs w:val="24"/>
-        </w:rPr>
-        <w:t>l₁l</w:t>
-      </w:r>
-      <w:proofErr w:type="spellEnd"/>
-      <w:proofErr w:type="gramStart"/>
-      <w:r>
-        <w:rPr>
-          <w:rFonts w:ascii="Cambria Math" w:eastAsia="Cambria Math" w:hAnsi="Cambria Math" w:cs="Cambria Math"/>
-          <w:color w:val="1B2A4A"/>
-          <w:sz w:val="24"/>
-          <w:szCs w:val="24"/>
-        </w:rPr>
-        <w:t>₂(</w:t>
-      </w:r>
-      <w:proofErr w:type="gramEnd"/>
-      <w:r>
-        <w:rPr>
-          <w:rFonts w:ascii="Cambria Math" w:eastAsia="Cambria Math" w:hAnsi="Cambria Math" w:cs="Cambria Math"/>
-          <w:color w:val="1B2A4A"/>
-          <w:sz w:val="24"/>
-          <w:szCs w:val="24"/>
-        </w:rPr>
-        <w:t xml:space="preserve">s₁₂c₁ − </w:t>
-      </w:r>
-      <w:proofErr w:type="spellStart"/>
-      <w:r>
-        <w:rPr>
-          <w:rFonts w:ascii="Cambria Math" w:eastAsia="Cambria Math" w:hAnsi="Cambria Math" w:cs="Cambria Math"/>
-          <w:color w:val="1B2A4A"/>
-          <w:sz w:val="24"/>
-          <w:szCs w:val="24"/>
-        </w:rPr>
-        <w:t>s₁c</w:t>
-      </w:r>
-      <w:proofErr w:type="spellEnd"/>
-      <w:r>
-        <w:rPr>
-          <w:rFonts w:ascii="Cambria Math" w:eastAsia="Cambria Math" w:hAnsi="Cambria Math" w:cs="Cambria Math"/>
-          <w:color w:val="1B2A4A"/>
-          <w:sz w:val="24"/>
-          <w:szCs w:val="24"/>
-        </w:rPr>
-        <w:t xml:space="preserve">₁₂) = </w:t>
-      </w:r>
-      <w:proofErr w:type="spellStart"/>
-      <w:r>
-        <w:rPr>
-          <w:rFonts w:ascii="Cambria Math" w:eastAsia="Cambria Math" w:hAnsi="Cambria Math" w:cs="Cambria Math"/>
-          <w:color w:val="1B2A4A"/>
-          <w:sz w:val="24"/>
-          <w:szCs w:val="24"/>
-        </w:rPr>
-        <w:t>l₁l</w:t>
-      </w:r>
-      <w:proofErr w:type="spellEnd"/>
-      <w:r>
-        <w:rPr>
-          <w:rFonts w:ascii="Cambria Math" w:eastAsia="Cambria Math" w:hAnsi="Cambria Math" w:cs="Cambria Math"/>
-          <w:color w:val="1B2A4A"/>
-          <w:sz w:val="24"/>
-          <w:szCs w:val="24"/>
-        </w:rPr>
-        <w:t xml:space="preserve">₂ </w:t>
-      </w:r>
-      <w:proofErr w:type="gramStart"/>
-      <w:r>
-        <w:rPr>
-          <w:rFonts w:ascii="Cambria Math" w:eastAsia="Cambria Math" w:hAnsi="Cambria Math" w:cs="Cambria Math"/>
-          <w:color w:val="1B2A4A"/>
-          <w:sz w:val="24"/>
-          <w:szCs w:val="24"/>
-        </w:rPr>
-        <w:t>sin(</w:t>
-      </w:r>
-      <w:proofErr w:type="gramEnd"/>
-      <w:r>
-        <w:rPr>
-          <w:rFonts w:ascii="Cambria Math" w:eastAsia="Cambria Math" w:hAnsi="Cambria Math" w:cs="Cambria Math"/>
-          <w:color w:val="1B2A4A"/>
-          <w:sz w:val="24"/>
-          <w:szCs w:val="24"/>
-        </w:rPr>
-        <w:t xml:space="preserve">θ₁ + θ₂ − θ₁) = </w:t>
-      </w:r>
-      <w:proofErr w:type="spellStart"/>
-      <w:r>
-        <w:rPr>
-          <w:rFonts w:ascii="Cambria Math" w:eastAsia="Cambria Math" w:hAnsi="Cambria Math" w:cs="Cambria Math"/>
-          <w:color w:val="1B2A4A"/>
-          <w:sz w:val="24"/>
-          <w:szCs w:val="24"/>
-        </w:rPr>
-        <w:t>l₁l</w:t>
-      </w:r>
-      <w:proofErr w:type="spellEnd"/>
-      <w:r>
-        <w:rPr>
-          <w:rFonts w:ascii="Cambria Math" w:eastAsia="Cambria Math" w:hAnsi="Cambria Math" w:cs="Cambria Math"/>
-          <w:color w:val="1B2A4A"/>
-          <w:sz w:val="24"/>
-          <w:szCs w:val="24"/>
-        </w:rPr>
-        <w:t>₂ sin(θ₂)</w:t>
+        <w:t xml:space="preserve">= l₁l₂(s₁₂c₁ − s₁c₁₂) = l₁l₂ sin(θ₁ + θ₂ − θ₁) = l₁l₂ sin(θ₂)</w:t>
       </w:r>
     </w:p>
     <w:p>
@@ -4604,15 +3155,7 @@
         <w:t xml:space="preserve">θ₂ = 0° (full extension): </w:t>
       </w:r>
       <w:r>
-        <w:t xml:space="preserve">The arm is stretched to its maximum reach. The hand can only move perpendicular to the arm—it has lost the ability to move radially outward. This is the only singularity our model can </w:t>
-      </w:r>
-      <w:proofErr w:type="gramStart"/>
-      <w:r>
-        <w:t>actually reach</w:t>
-      </w:r>
-      <w:proofErr w:type="gramEnd"/>
-      <w:r>
-        <w:t>.</w:t>
+        <w:t xml:space="preserve">The arm is stretched to its maximum reach. The hand can only move perpendicular to the arm—it has lost the ability to move radially outward. This is the only singularity our model can actually reach.</w:t>
       </w:r>
     </w:p>
     <w:p>
@@ -4707,7 +3250,7 @@
           <wp:inline distT="0" distB="0" distL="0" distR="0" wp14:anchorId="79B2416B" wp14:editId="4684B090">
             <wp:extent cx="5334000" cy="2286000"/>
             <wp:effectExtent l="0" t="0" r="0" b="0"/>
-            <wp:docPr id="5" name="Figure 6. Left: near singularity (θ₂ = 5°), the velocity ellipsoid is highly elongated — radial motion is nearly impossible. Right: at θ₂ = 90°, the ellipsoid is nearly circular." descr="Figure 6. Left: near singularity (θ₂ = 5°), the velocity ellipsoid is highly elongated — radial motion is nearly impossible. Right: at θ₂ = 90°, the ellipsoid is nearly circular." title="Figure 6. Left: near singularity (θ₂ = 5°), the velocity ellipsoid is highly elongated — radial motion is nearly impossible. Right: at θ₂ = 90°, the ellipsoid is nearly circular."/>
+            <wp:docPr id="5" name="Figure 7. Left: near singularity (θ₂ = 5°), the velocity ellipsoid is highly elongated — radial motion is nearly impossible. Right: at θ₂ = 90°, the ellipsoid is nearly circular." descr="Figure 7. Left: near singularity (θ₂ = 5°), the velocity ellipsoid is highly elongated — radial motion is nearly impossible. Right: at θ₂ = 90°, the ellipsoid is nearly circular." title="Figure 7. Left: near singularity (θ₂ = 5°), the velocity ellipsoid is highly elongated — radial motion is nearly impossible. Right: at θ₂ = 90°, the ellipsoid is nearly circular."/>
             <wp:cNvGraphicFramePr>
               <a:graphicFrameLocks xmlns:a="http://schemas.openxmlformats.org/drawingml/2006/main" noChangeAspect="1"/>
             </wp:cNvGraphicFramePr>
@@ -4715,7 +3258,7 @@
               <a:graphicData uri="http://schemas.openxmlformats.org/drawingml/2006/picture">
                 <pic:pic xmlns:pic="http://schemas.openxmlformats.org/drawingml/2006/picture">
                   <pic:nvPicPr>
-                    <pic:cNvPr id="5" name="Figure 6. Left: near singularity (θ₂ = 5°), the velocity ellipsoid is highly elongated — radial motion is nearly impossible. Right: at θ₂ = 90°, the ellipsoid is nearly circular." descr="Figure 6. Left: near singularity (θ₂ = 5°), the velocity ellipsoid is highly elongated — radial motion is nearly impossible. Right: at θ₂ = 90°, the ellipsoid is nearly circular." title="Figure 6. Left: near singularity (θ₂ = 5°), the velocity ellipsoid is highly elongated — radial motion is nearly impossible. Right: at θ₂ = 90°, the ellipsoid is nearly circular."/>
+                    <pic:cNvPr id="5" name="Figure 7. Left: near singularity (θ₂ = 5°), the velocity ellipsoid is highly elongated — radial motion is nearly impossible. Right: at θ₂ = 90°, the ellipsoid is nearly circular." descr="Figure 7. Left: near singularity (θ₂ = 5°), the velocity ellipsoid is highly elongated — radial motion is nearly impossible. Right: at θ₂ = 90°, the ellipsoid is nearly circular." title="Figure 7. Left: near singularity (θ₂ = 5°), the velocity ellipsoid is highly elongated — radial motion is nearly impossible. Right: at θ₂ = 90°, the ellipsoid is nearly circular."/>
                     <pic:cNvPicPr>
                       <a:picLocks noChangeAspect="1" noChangeArrowheads="1"/>
                     </pic:cNvPicPr>
@@ -4755,7 +3298,7 @@
           <w:sz w:val="20"/>
           <w:szCs w:val="20"/>
         </w:rPr>
-        <w:t>Figure 6. Left: near singularity (θ₂ = 5°), the velocity ellipsoid is highly elongated — radial motion is nearly impossible. Right: at θ₂ = 90°, the ellipsoid is nearly circular.</w:t>
+        <w:t>Figure 7. Left: near singularity (θ₂ = 5°), the velocity ellipsoid is highly elongated — radial motion is nearly impossible. Right: at θ₂ = 90°, the ellipsoid is nearly circular.</w:t>
       </w:r>
     </w:p>
     <w:p>
@@ -4765,13 +3308,8 @@
           <w:bottom w:val="single" w:sz="2" w:space="4" w:color="2E86AB"/>
         </w:pBdr>
       </w:pPr>
-      <w:proofErr w:type="gramStart"/>
-      <w:r>
-        <w:t>4.3  The</w:t>
-      </w:r>
-      <w:proofErr w:type="gramEnd"/>
-      <w:r>
-        <w:t xml:space="preserve"> Jacobian as a Velocity Transformer</w:t>
+      <w:r>
+        <w:t xml:space="preserve">4.3  The Jacobian as a Velocity Transformer</w:t>
       </w:r>
     </w:p>
     <w:p>
@@ -4956,15 +3494,7 @@
         <w:spacing w:after="160" w:line="300" w:lineRule="auto"/>
       </w:pPr>
       <w:r>
-        <w:t>The Jacobian tells us how joint velocities map to endpoint velocities. But which endpoint directions are “easy” (achievable with small joint speeds</w:t>
-      </w:r>
-      <w:proofErr w:type="gramStart"/>
-      <w:r>
-        <w:t>)</w:t>
-      </w:r>
-      <w:proofErr w:type="gramEnd"/>
-      <w:r>
-        <w:t xml:space="preserve"> and which are “hard” (requiring large joint speeds)? The </w:t>
+        <w:t xml:space="preserve">The Jacobian tells us how joint velocities map to endpoint velocities. But which endpoint directions are “easy” (achievable with small joint speeds) and which are “hard” (requiring large joint speeds)? The </w:t>
       </w:r>
       <w:r>
         <w:rPr>
@@ -4984,11 +3514,9 @@
           <w:bottom w:val="single" w:sz="2" w:space="4" w:color="2E86AB"/>
         </w:pBdr>
       </w:pPr>
-      <w:proofErr w:type="gramStart"/>
       <w:r>
         <w:t>5.1  Construction</w:t>
       </w:r>
-      <w:proofErr w:type="gramEnd"/>
     </w:p>
     <w:p>
       <w:pPr>
@@ -5139,15 +3667,7 @@
         <w:spacing w:after="160" w:line="300" w:lineRule="auto"/>
       </w:pPr>
       <w:r>
-        <w:t xml:space="preserve">This defines a unit circle in joint-velocity space. Under the linear mapping ṗ = </w:t>
-      </w:r>
-      <w:proofErr w:type="spellStart"/>
-      <w:r>
-        <w:t>Jθ</w:t>
-      </w:r>
-      <w:proofErr w:type="spellEnd"/>
-      <w:r>
-        <w:t>̇, this circle maps to an ellipse in endpoint-velocity space. To characterize this ellipse, substitute θ̇ = J⁻¹ṗ into the unit-norm constraint:</w:t>
+        <w:t xml:space="preserve">This defines a unit circle in joint-velocity space. Under the linear mapping ṗ = Jθ̇, this circle maps to an ellipse in endpoint-velocity space. To characterize this ellipse, substitute θ̇ = J⁻¹ṗ into the unit-norm constraint:</w:t>
       </w:r>
     </w:p>
     <w:p>
@@ -5166,27 +3686,7 @@
           <w:sz w:val="24"/>
           <w:szCs w:val="24"/>
         </w:rPr>
-        <w:t>(J⁻¹</w:t>
-      </w:r>
-      <w:proofErr w:type="gramStart"/>
-      <w:r>
-        <w:rPr>
-          <w:rFonts w:ascii="Cambria Math" w:eastAsia="Cambria Math" w:hAnsi="Cambria Math" w:cs="Cambria Math"/>
-          <w:color w:val="1B2A4A"/>
-          <w:sz w:val="24"/>
-          <w:szCs w:val="24"/>
-        </w:rPr>
-        <w:t>ṗ)ᵀ</w:t>
-      </w:r>
-      <w:proofErr w:type="gramEnd"/>
-      <w:r>
-        <w:rPr>
-          <w:rFonts w:ascii="Cambria Math" w:eastAsia="Cambria Math" w:hAnsi="Cambria Math" w:cs="Cambria Math"/>
-          <w:color w:val="1B2A4A"/>
-          <w:sz w:val="24"/>
-          <w:szCs w:val="24"/>
-        </w:rPr>
-        <w:t>(J⁻¹ṗ) = 1</w:t>
+        <w:t>(J⁻¹ṗ)ᵀ(J⁻¹ṗ) = 1</w:t>
       </w:r>
       <w:r>
         <w:rPr>
@@ -5279,13 +3779,8 @@
           <w:bottom w:val="single" w:sz="2" w:space="4" w:color="2E86AB"/>
         </w:pBdr>
       </w:pPr>
-      <w:proofErr w:type="gramStart"/>
-      <w:r>
-        <w:t>5.2  Eigenvalue</w:t>
-      </w:r>
-      <w:proofErr w:type="gramEnd"/>
-      <w:r>
-        <w:t xml:space="preserve"> Analysis</w:t>
+      <w:r>
+        <w:t xml:space="preserve">5.2  Eigenvalue Analysis</w:t>
       </w:r>
     </w:p>
     <w:p>
@@ -5400,13 +3895,8 @@
           <w:bottom w:val="single" w:sz="2" w:space="4" w:color="2E86AB"/>
         </w:pBdr>
       </w:pPr>
-      <w:proofErr w:type="gramStart"/>
-      <w:r>
-        <w:t>5.3  Yoshikawa’s</w:t>
-      </w:r>
-      <w:proofErr w:type="gramEnd"/>
-      <w:r>
-        <w:t xml:space="preserve"> Manipulability Measure</w:t>
+      <w:r>
+        <w:t xml:space="preserve">5.3  Yoshikawa’s Manipulability Measure</w:t>
       </w:r>
     </w:p>
     <w:p>
@@ -5433,59 +3923,8 @@
           <w:sz w:val="24"/>
           <w:szCs w:val="24"/>
         </w:rPr>
-        <w:t xml:space="preserve">w(q) = </w:t>
-      </w:r>
-      <w:proofErr w:type="gramStart"/>
-      <w:r>
-        <w:rPr>
-          <w:rFonts w:ascii="Cambria Math" w:eastAsia="Cambria Math" w:hAnsi="Cambria Math" w:cs="Cambria Math"/>
-          <w:color w:val="1B2A4A"/>
-          <w:sz w:val="24"/>
-          <w:szCs w:val="24"/>
-        </w:rPr>
-        <w:t>√( det</w:t>
-      </w:r>
-      <w:proofErr w:type="gramEnd"/>
-      <w:r>
-        <w:rPr>
-          <w:rFonts w:ascii="Cambria Math" w:eastAsia="Cambria Math" w:hAnsi="Cambria Math" w:cs="Cambria Math"/>
-          <w:color w:val="1B2A4A"/>
-          <w:sz w:val="24"/>
-          <w:szCs w:val="24"/>
-        </w:rPr>
-        <w:t>(JJᵀ</w:t>
-      </w:r>
-      <w:proofErr w:type="gramStart"/>
-      <w:r>
-        <w:rPr>
-          <w:rFonts w:ascii="Cambria Math" w:eastAsia="Cambria Math" w:hAnsi="Cambria Math" w:cs="Cambria Math"/>
-          <w:color w:val="1B2A4A"/>
-          <w:sz w:val="24"/>
-          <w:szCs w:val="24"/>
-        </w:rPr>
-        <w:t>) )</w:t>
-      </w:r>
-      <w:proofErr w:type="gramEnd"/>
-      <w:r>
-        <w:rPr>
-          <w:rFonts w:ascii="Cambria Math" w:eastAsia="Cambria Math" w:hAnsi="Cambria Math" w:cs="Cambria Math"/>
-          <w:color w:val="1B2A4A"/>
-          <w:sz w:val="24"/>
-          <w:szCs w:val="24"/>
-        </w:rPr>
-        <w:t xml:space="preserve"> = |det(J)| = |l₁ l₂ sin(θ</w:t>
-      </w:r>
-      <w:proofErr w:type="gramStart"/>
-      <w:r>
-        <w:rPr>
-          <w:rFonts w:ascii="Cambria Math" w:eastAsia="Cambria Math" w:hAnsi="Cambria Math" w:cs="Cambria Math"/>
-          <w:color w:val="1B2A4A"/>
-          <w:sz w:val="24"/>
-          <w:szCs w:val="24"/>
-        </w:rPr>
-        <w:t>₂)|</w:t>
-      </w:r>
-      <w:proofErr w:type="gramEnd"/>
+        <w:t xml:space="preserve">w(q) = √( det(JJᵀ) ) = |det(J)| = |l₁ l₂ sin(θ₂)|</w:t>
+      </w:r>
       <w:r>
         <w:rPr>
           <w:color w:val="666666"/>
@@ -5502,31 +3941,7 @@
       </w:pPr>
       <w:r>
         <w:lastRenderedPageBreak/>
-        <w:t xml:space="preserve">This equals the area of the manipulability ellipsoid (up to a factor of π). The derivation follows from the fact that </w:t>
-      </w:r>
-      <w:proofErr w:type="gramStart"/>
-      <w:r>
-        <w:t>det(</w:t>
-      </w:r>
-      <w:proofErr w:type="gramEnd"/>
-      <w:r>
-        <w:t xml:space="preserve">JJᵀ) = </w:t>
-      </w:r>
-      <w:proofErr w:type="spellStart"/>
-      <w:r>
-        <w:t>λ₁λ</w:t>
-      </w:r>
-      <w:proofErr w:type="spellEnd"/>
-      <w:r>
-        <w:t>₂, and the area of an ellipse with semi-axes √λ₁ and √λ₂ is π√(</w:t>
-      </w:r>
-      <w:proofErr w:type="spellStart"/>
-      <w:r>
-        <w:t>λ₁λ</w:t>
-      </w:r>
-      <w:proofErr w:type="spellEnd"/>
-      <w:r>
-        <w:t>₂).</w:t>
+        <w:t xml:space="preserve">This equals the area of the manipulability ellipsoid (up to a factor of π). The derivation follows from the fact that det(JJᵀ) = λ₁λ₂, and the area of an ellipse with semi-axes √λ₁ and √λ₂ is π√(λ₁λ₂).</w:t>
       </w:r>
     </w:p>
     <w:p>
@@ -5609,7 +4024,7 @@
           <wp:inline distT="0" distB="0" distL="0" distR="0" wp14:anchorId="6B76668B" wp14:editId="3848C15B">
             <wp:extent cx="4953000" cy="2190750"/>
             <wp:effectExtent l="0" t="0" r="0" b="0"/>
-            <wp:docPr id="6" name="Figure 7. Yoshikawa's manipulability w over the anatomical elbow range [0°, 145°]. Maximum at θ₂ = 90°; singularity at θ₂ = 0°." descr="Figure 7. Yoshikawa's manipulability w over the anatomical elbow range [0°, 145°]. Maximum at θ₂ = 90°; singularity at θ₂ = 0°." title="Figure 7. Yoshikawa's manipulability w over the anatomical elbow range [0°, 145°]. Maximum at θ₂ = 90°; singularity at θ₂ = 0°."/>
+            <wp:docPr id="6" name="Figure 8. Yoshikawa's manipulability w over the anatomical elbow range [0°, 145°]. Maximum at θ₂ = 90°; singularity at θ₂ = 0°." descr="Figure 8. Yoshikawa's manipulability w over the anatomical elbow range [0°, 145°]. Maximum at θ₂ = 90°; singularity at θ₂ = 0°." title="Figure 8. Yoshikawa's manipulability w over the anatomical elbow range [0°, 145°]. Maximum at θ₂ = 90°; singularity at θ₂ = 0°."/>
             <wp:cNvGraphicFramePr>
               <a:graphicFrameLocks xmlns:a="http://schemas.openxmlformats.org/drawingml/2006/main" noChangeAspect="1"/>
             </wp:cNvGraphicFramePr>
@@ -5617,7 +4032,7 @@
               <a:graphicData uri="http://schemas.openxmlformats.org/drawingml/2006/picture">
                 <pic:pic xmlns:pic="http://schemas.openxmlformats.org/drawingml/2006/picture">
                   <pic:nvPicPr>
-                    <pic:cNvPr id="6" name="Figure 7. Yoshikawa's manipulability w over the anatomical elbow range [0°, 145°]. Maximum at θ₂ = 90°; singularity at θ₂ = 0°." descr="Figure 7. Yoshikawa's manipulability w over the anatomical elbow range [0°, 145°]. Maximum at θ₂ = 90°; singularity at θ₂ = 0°." title="Figure 7. Yoshikawa's manipulability w over the anatomical elbow range [0°, 145°]. Maximum at θ₂ = 90°; singularity at θ₂ = 0°."/>
+                    <pic:cNvPr id="6" name="Figure 8. Yoshikawa's manipulability w over the anatomical elbow range [0°, 145°]. Maximum at θ₂ = 90°; singularity at θ₂ = 0°." descr="Figure 8. Yoshikawa's manipulability w over the anatomical elbow range [0°, 145°]. Maximum at θ₂ = 90°; singularity at θ₂ = 0°." title="Figure 8. Yoshikawa's manipulability w over the anatomical elbow range [0°, 145°]. Maximum at θ₂ = 90°; singularity at θ₂ = 0°."/>
                     <pic:cNvPicPr>
                       <a:picLocks noChangeAspect="1" noChangeArrowheads="1"/>
                     </pic:cNvPicPr>
@@ -5657,7 +4072,7 @@
           <w:sz w:val="20"/>
           <w:szCs w:val="20"/>
         </w:rPr>
-        <w:t>Figure 7. Yoshikawa's manipulability w over the anatomical elbow range [0°, 145°]. Maximum at θ₂ = 90°; singularity at θ₂ = 0°.</w:t>
+        <w:t>Figure 8. Yoshikawa's manipulability w over the anatomical elbow range [0°, 145°]. Maximum at θ₂ = 90°; singularity at θ₂ = 0°.</w:t>
       </w:r>
     </w:p>
     <w:tbl>
@@ -5726,7 +4141,7 @@
           <wp:inline distT="0" distB="0" distL="0" distR="0" wp14:anchorId="5A2E983F" wp14:editId="4893A112">
             <wp:extent cx="4572000" cy="4000500"/>
             <wp:effectExtent l="0" t="0" r="0" b="0"/>
-            <wp:docPr id="7" name="Figure 8. Manipulability ellipsoids sampled across the workspace. Blue = high dexterity (θ₂ near 90°); red = low dexterity (θ₂ near 0°)." descr="Figure 8. Manipulability ellipsoids sampled across the workspace. Blue = high dexterity (θ₂ near 90°); red = low dexterity (θ₂ near 0°)." title="Figure 8. Manipulability ellipsoids sampled across the workspace. Blue = high dexterity (θ₂ near 90°); red = low dexterity (θ₂ near 0°)."/>
+            <wp:docPr id="7" name="Figure 9. Manipulability ellipsoids sampled across the workspace. Blue = high dexterity (θ₂ near 90°); red = low dexterity (θ₂ near 0°)." descr="Figure 9. Manipulability ellipsoids sampled across the workspace. Blue = high dexterity (θ₂ near 90°); red = low dexterity (θ₂ near 0°)." title="Figure 9. Manipulability ellipsoids sampled across the workspace. Blue = high dexterity (θ₂ near 90°); red = low dexterity (θ₂ near 0°)."/>
             <wp:cNvGraphicFramePr>
               <a:graphicFrameLocks xmlns:a="http://schemas.openxmlformats.org/drawingml/2006/main" noChangeAspect="1"/>
             </wp:cNvGraphicFramePr>
@@ -5734,7 +4149,7 @@
               <a:graphicData uri="http://schemas.openxmlformats.org/drawingml/2006/picture">
                 <pic:pic xmlns:pic="http://schemas.openxmlformats.org/drawingml/2006/picture">
                   <pic:nvPicPr>
-                    <pic:cNvPr id="7" name="Figure 8. Manipulability ellipsoids sampled across the workspace. Blue = high dexterity (θ₂ near 90°); red = low dexterity (θ₂ near 0°)." descr="Figure 8. Manipulability ellipsoids sampled across the workspace. Blue = high dexterity (θ₂ near 90°); red = low dexterity (θ₂ near 0°)." title="Figure 8. Manipulability ellipsoids sampled across the workspace. Blue = high dexterity (θ₂ near 90°); red = low dexterity (θ₂ near 0°)."/>
+                    <pic:cNvPr id="7" name="Figure 9. Manipulability ellipsoids sampled across the workspace. Blue = high dexterity (θ₂ near 90°); red = low dexterity (θ₂ near 0°)." descr="Figure 9. Manipulability ellipsoids sampled across the workspace. Blue = high dexterity (θ₂ near 90°); red = low dexterity (θ₂ near 0°)." title="Figure 9. Manipulability ellipsoids sampled across the workspace. Blue = high dexterity (θ₂ near 90°); red = low dexterity (θ₂ near 0°)."/>
                     <pic:cNvPicPr>
                       <a:picLocks noChangeAspect="1" noChangeArrowheads="1"/>
                     </pic:cNvPicPr>
@@ -5774,7 +4189,7 @@
           <w:sz w:val="20"/>
           <w:szCs w:val="20"/>
         </w:rPr>
-        <w:t>Figure 8. Manipulability ellipsoids sampled across the workspace. Blue = high dexterity (θ₂ near 90°); red = low dexterity (θ₂ near 0°).</w:t>
+        <w:t>Figure 9. Manipulability ellipsoids sampled across the workspace. Blue = high dexterity (θ₂ near 90°); red = low dexterity (θ₂ near 0°).</w:t>
       </w:r>
     </w:p>
     <w:p>
@@ -5784,53 +4199,16 @@
           <w:bottom w:val="single" w:sz="2" w:space="4" w:color="2E86AB"/>
         </w:pBdr>
       </w:pPr>
-      <w:proofErr w:type="gramStart"/>
-      <w:r>
-        <w:t>5.4  The</w:t>
-      </w:r>
-      <w:proofErr w:type="gramEnd"/>
-      <w:r>
-        <w:t xml:space="preserve"> Force Ellipsoid</w:t>
-      </w:r>
-    </w:p>
-    <w:p>
-      <w:pPr>
-        <w:spacing w:after="160" w:line="300" w:lineRule="auto"/>
-      </w:pPr>
-      <w:r>
-        <w:t>There is a dual ellipsoid for force. In static equilibrium — the arm holding a fixed posture and pushing isometrically against a rigid constraint — the principle of virtual work (</w:t>
-      </w:r>
-      <w:proofErr w:type="spellStart"/>
-      <w:r>
-        <w:t>τᵀδq</w:t>
-      </w:r>
-      <w:proofErr w:type="spellEnd"/>
-      <w:r>
-        <w:t xml:space="preserve"> = </w:t>
-      </w:r>
-      <w:proofErr w:type="spellStart"/>
-      <w:r>
-        <w:t>Fᵀδp</w:t>
-      </w:r>
-      <w:proofErr w:type="spellEnd"/>
-      <w:r>
-        <w:t xml:space="preserve">, with </w:t>
-      </w:r>
-      <w:proofErr w:type="spellStart"/>
-      <w:r>
-        <w:t>δp</w:t>
-      </w:r>
-      <w:proofErr w:type="spellEnd"/>
-      <w:r>
-        <w:t xml:space="preserve"> = </w:t>
-      </w:r>
-      <w:proofErr w:type="spellStart"/>
-      <w:r>
-        <w:t>Jδq</w:t>
-      </w:r>
-      <w:proofErr w:type="spellEnd"/>
-      <w:r>
-        <w:t>) gives τ = JᵀF, and therefore:</w:t>
+      <w:r>
+        <w:t xml:space="preserve">5.4  The Force Ellipsoid</w:t>
+      </w:r>
+    </w:p>
+    <w:p>
+      <w:pPr>
+        <w:spacing w:after="160" w:line="300" w:lineRule="auto"/>
+      </w:pPr>
+      <w:r>
+        <w:t xml:space="preserve">There is a dual ellipsoid for force. In static equilibrium — the arm holding a fixed posture and pushing isometrically against a rigid constraint — the principle of virtual work (τᵀδq = Fᵀδp, with δp = Jδq) gives τ = JᵀF, and therefore:</w:t>
       </w:r>
     </w:p>
     <w:p>
@@ -5907,61 +4285,9 @@
               <w:spacing w:after="160" w:line="300" w:lineRule="auto"/>
             </w:pPr>
             <w:r>
-              <w:t>Equation 5.6 assumes the arm is not accelerating. Because our arm is confined to the horizontal plane, gravity drops out of the equations of motion, but the inertial terms do not. The full dynamics are M(q)θ̈ + C(</w:t>
-            </w:r>
-            <w:proofErr w:type="spellStart"/>
-            <w:proofErr w:type="gramStart"/>
-            <w:r>
-              <w:t>q,θ</w:t>
-            </w:r>
-            <w:proofErr w:type="spellEnd"/>
-            <w:r>
-              <w:t>̇</w:t>
-            </w:r>
-            <w:proofErr w:type="gramEnd"/>
-            <w:r>
-              <w:t>)θ̇ + JᵀF = τ, so in general F = J⁻</w:t>
-            </w:r>
-            <w:proofErr w:type="gramStart"/>
-            <w:r>
-              <w:t>ᵀ[</w:t>
-            </w:r>
-            <w:proofErr w:type="gramEnd"/>
-            <w:r>
-              <w:t>τ − M(q)θ̈ − C(</w:t>
-            </w:r>
-            <w:proofErr w:type="spellStart"/>
-            <w:proofErr w:type="gramStart"/>
-            <w:r>
-              <w:t>q,θ</w:t>
-            </w:r>
-            <w:proofErr w:type="spellEnd"/>
-            <w:r>
-              <w:t>̇</w:t>
-            </w:r>
-            <w:proofErr w:type="gramEnd"/>
-            <w:r>
-              <w:t xml:space="preserve">)θ̇]. During movement, part of the joint torque accelerates the limb and balances Coriolis and centrifugal </w:t>
-            </w:r>
-            <w:proofErr w:type="gramStart"/>
-            <w:r>
-              <w:t>loads, and</w:t>
-            </w:r>
-            <w:proofErr w:type="gramEnd"/>
-            <w:r>
-              <w:t xml:space="preserve"> never appears at the hand. Note that the duality itself is not restricted to statics: a force applied at the hand always contributes JᵀF to the joint torques, whatever the arm's velocity. What requires equilibrium is identifying the net joint torque with the endpoint force. The force ellipsoid is therefore a statement about isometric force production in a fixed posture; </w:t>
-            </w:r>
-            <w:r>
+              <w:t xml:space="preserve">Equation 5.6 assumes the arm is not accelerating. Because our arm is confined to the horizontal plane, gravity drops out of the equations of motion, but the inertial terms do not. The full dynamics are M(q)θ̈ + C(q,θ̇)θ̇ + JᵀF = τ, so in general F = J⁻ᵀ[τ − M(q)θ̈ − C(q,θ̇)θ̇]. During movement, part of the joint torque accelerates the limb and balances Coriolis and centrifugal loads, and never appears at the hand. Note that the duality itself is not restricted to statics: a force applied at the hand always contributes JᵀF to the joint torques, whatever the arm's velocity. What requires equilibrium is identifying the net joint torque with the endpoint force. The force ellipsoid is therefore a statement about isometric force production in a fixed posture; </w:t>
               <w:lastRenderedPageBreak/>
-              <w:t xml:space="preserve">its moving-arm counterpart is the endpoint-inertia (mobility) ellipsoid built from Λ(q) = (J M⁻¹ </w:t>
-            </w:r>
-            <w:proofErr w:type="gramStart"/>
-            <w:r>
-              <w:t>Jᵀ)⁻</w:t>
-            </w:r>
-            <w:proofErr w:type="gramEnd"/>
-            <w:r>
-              <w:t>¹.</w:t>
+              <w:t xml:space="preserve">its moving-arm counterpart is the endpoint-inertia (mobility) ellipsoid built from Λ(q) = (J M⁻¹ Jᵀ)⁻¹.</w:t>
             </w:r>
           </w:p>
         </w:tc>
@@ -5973,30 +4299,7 @@
         <w:spacing w:after="160" w:line="300" w:lineRule="auto"/>
       </w:pPr>
       <w:r>
-        <w:t xml:space="preserve">The force ellipsoid (constructed from JJᵀ) is the inverse of the velocity ellipsoid: substituting τ = JᵀF into the unit-norm torque constraint ||τ||² ≤ 1 gives </w:t>
-      </w:r>
-      <w:proofErr w:type="gramStart"/>
-      <w:r>
-        <w:t>Fᵀ(</w:t>
-      </w:r>
-      <w:proofErr w:type="gramEnd"/>
-      <w:r>
-        <w:t>JJᵀ)F ≤ 1, an ellipsoid whose semi-axes are the reciprocals 1/σᵢ of the velocity ellipsoid's. Directions in which the hand moves easily are directions in which it exerts force poorly, and vice versa. This is a kinematic version of the classical speed–force tradeoff in mechanics.</w:t>
-      </w:r>
-    </w:p>
-    <w:p>
-      <w:r>
-        <w:br w:type="page"/>
-      </w:r>
-    </w:p>
-    <w:p>
-      <w:pPr>
-        <w:pStyle w:val="Heading1"/>
-        <w:spacing w:before="0"/>
-      </w:pPr>
-      <w:r>
-        <w:lastRenderedPageBreak/>
-        <w:t>6. Kinematic Redundancy &amp; the Degrees of Freedom Problem</w:t>
+        <w:t xml:space="preserve">The force ellipsoid (constructed from JJᵀ) is the inverse of the velocity ellipsoid: substituting τ = JᵀF into the unit-norm torque constraint ||τ||² ≤ 1 gives Fᵀ(JJᵀ)F ≤ 1, an ellipsoid whose semi-axes are the reciprocals 1/σᵢ of the velocity ellipsoid's. Directions in which the hand moves easily are directions in which it exerts force poorly, and vice versa. This is a kinematic version of the classical speed–force tradeoff in mechanics.</w:t>
       </w:r>
     </w:p>
     <w:tbl>
@@ -6037,7 +4340,7 @@
                 <w:bCs/>
                 <w:color w:val="2E86AB"/>
               </w:rPr>
-              <w:t>A Note on Scope</w:t>
+              <w:t xml:space="preserve">Thought Exercise: What Does It Mean for the Two Ellipsoids to Be Perpendicular?</w:t>
             </w:r>
           </w:p>
           <w:p>
@@ -6045,6 +4348,319 @@
               <w:spacing w:after="160" w:line="300" w:lineRule="auto"/>
             </w:pPr>
             <w:r>
+              <w:t xml:space="preserve">At any non-singular posture the velocity and force ellipsoids share the same principal axes, but the </w:t>
+            </w:r>
+            <w:r>
+              <w:rPr>
+                <w:i/>
+                <w:iCs/>
+              </w:rPr>
+              <w:t xml:space="preserve">major</w:t>
+            </w:r>
+            <w:r>
+              <w:t xml:space="preserve"> axis of one is the </w:t>
+            </w:r>
+            <w:r>
+              <w:rPr>
+                <w:i/>
+                <w:iCs/>
+              </w:rPr>
+              <w:t xml:space="preserve">minor</w:t>
+            </w:r>
+            <w:r>
+              <w:t xml:space="preserve"> axis of the other — the two elongations are 90° apart. Before reading on, work out for yourself:</w:t>
+            </w:r>
+          </w:p>
+          <w:p>
+            <w:pPr>
+              <w:spacing w:after="160" w:line="300" w:lineRule="auto"/>
+            </w:pPr>
+            <w:r>
+              <w:rPr>
+                <w:b/>
+                <w:bCs/>
+              </w:rPr>
+              <w:t xml:space="preserve">(a) </w:t>
+            </w:r>
+            <w:r>
+              <w:t xml:space="preserve">Why must the axes be perpendicular at all, and why are the semi-axes exact </w:t>
+            </w:r>
+            <w:r>
+              <w:rPr>
+                <w:i/>
+                <w:iCs/>
+              </w:rPr>
+              <w:t xml:space="preserve">reciprocals</w:t>
+            </w:r>
+            <w:r>
+              <w:t xml:space="preserve"> (σᵢ and 1/σᵢ) rather than merely different?</w:t>
+            </w:r>
+          </w:p>
+          <w:p>
+            <w:pPr>
+              <w:spacing w:after="160" w:line="300" w:lineRule="auto"/>
+            </w:pPr>
+            <w:r>
+              <w:rPr>
+                <w:b/>
+                <w:bCs/>
+              </w:rPr>
+              <w:t xml:space="preserve">(b) </w:t>
+            </w:r>
+            <w:r>
+              <w:t xml:space="preserve">What is the physical reason that a direction of easy motion </w:t>
+            </w:r>
+            <w:r>
+              <w:rPr>
+                <w:i/>
+                <w:iCs/>
+              </w:rPr>
+              <w:t xml:space="preserve">must</w:t>
+            </w:r>
+            <w:r>
+              <w:t xml:space="preserve"> be a direction of weak force? (Hint: the Jacobian stores no energy.)</w:t>
+            </w:r>
+          </w:p>
+          <w:p>
+            <w:pPr>
+              <w:spacing w:after="0" w:line="300" w:lineRule="auto"/>
+            </w:pPr>
+            <w:r>
+              <w:rPr>
+                <w:b/>
+                <w:bCs/>
+              </w:rPr>
+              <w:t xml:space="preserve">(c) </w:t>
+            </w:r>
+            <w:r>
+              <w:t xml:space="preserve">Yoshikawa’s w is maximal at θ₂ = 90°. Does that mean the hand is equally capable in every direction at that posture?</w:t>
+            </w:r>
+          </w:p>
+        </w:tc>
+      </w:tr>
+    </w:tbl>
+    <w:p>
+      <w:pPr>
+        <w:spacing w:after="0"/>
+      </w:pPr>
+    </w:p>
+    <w:tbl>
+      <w:tblPr>
+        <w:tblW w:w="9360" w:type="dxa"/>
+        <w:tblLayout w:type="fixed"/>
+        <w:tblCellMar>
+          <w:top w:w="120" w:type="dxa"/>
+          <w:left w:w="200" w:type="dxa"/>
+          <w:bottom w:w="120" w:type="dxa"/>
+          <w:right w:w="200" w:type="dxa"/>
+        </w:tblCellMar>
+        <w:tblLook w:val="0000" w:firstRow="0" w:lastRow="0" w:firstColumn="0" w:lastColumn="0" w:noHBand="0" w:noVBand="0"/>
+      </w:tblPr>
+      <w:tblGrid>
+        <w:gridCol w:w="9360"/>
+      </w:tblGrid>
+      <w:tr>
+        <w:tc>
+          <w:tcPr>
+            <w:tcW w:w="9360" w:type="dxa"/>
+            <w:tcBorders>
+              <w:top w:val="single" w:sz="2" w:space="0" w:color="2E86AB"/>
+              <w:left w:val="single" w:sz="2" w:space="0" w:color="2E86AB"/>
+              <w:bottom w:val="single" w:sz="2" w:space="0" w:color="2E86AB"/>
+              <w:right w:val="single" w:sz="2" w:space="0" w:color="2E86AB"/>
+            </w:tcBorders>
+            <w:shd w:val="clear" w:color="auto" w:fill="E8F1F8"/>
+          </w:tcPr>
+          <w:p>
+            <w:pPr>
+              <w:spacing w:after="80"/>
+            </w:pPr>
+            <w:r>
+              <w:rPr>
+                <w:rFonts w:ascii="Georgia" w:eastAsia="Georgia" w:hAnsi="Georgia" w:cs="Georgia"/>
+                <w:b/>
+                <w:bCs/>
+                <w:color w:val="2E86AB"/>
+              </w:rPr>
+              <w:t xml:space="preserve">Answer</w:t>
+            </w:r>
+          </w:p>
+          <w:p>
+            <w:pPr>
+              <w:spacing w:after="160" w:line="300" w:lineRule="auto"/>
+            </w:pPr>
+            <w:r>
+              <w:rPr>
+                <w:b/>
+                <w:bCs/>
+              </w:rPr>
+              <w:t xml:space="preserve">(a)  Geometry. </w:t>
+            </w:r>
+            <w:r>
+              <w:t xml:space="preserve">Both ellipsoids are built from the same symmetric, positive-definite matrix: the velocity ellipsoid from JJᵀ and the force ellipsoid from its inverse. The spectral theorem guarantees that a symmetric matrix has mutually orthogonal eigenvectors, and a matrix and its inverse have </w:t>
+            </w:r>
+            <w:r>
+              <w:rPr>
+                <w:i/>
+                <w:iCs/>
+              </w:rPr>
+              <w:t xml:space="preserve">the same</w:t>
+            </w:r>
+            <w:r>
+              <w:t xml:space="preserve"> eigenvectors with reciprocal eigenvalues. The two ellipsoids are therefore locked to one orthogonal frame, with semi-axes σᵢ and 1/σᵢ. This is not a peculiarity of our arm — it holds at every non-singular posture of every manipulator.</w:t>
+            </w:r>
+          </w:p>
+          <w:p>
+            <w:pPr>
+              <w:spacing w:after="160" w:line="300" w:lineRule="auto"/>
+            </w:pPr>
+            <w:r>
+              <w:rPr>
+                <w:b/>
+                <w:bCs/>
+              </w:rPr>
+              <w:t xml:space="preserve">(b)  Power. </w:t>
+            </w:r>
+            <w:r>
+              <w:t xml:space="preserve">The Jacobian is a massless, rigid, instantaneous transmission: it stores no energy, so the power delivered at the hand equals the power supplied at the joints, Fᵀṗ = τᵀθ̇, for every possible motion. Along a principal direction where J amplifies joint velocity into hand velocity by σ, it must therefore attenuate hand force into joint torque by that same σ — so with unit torque available, the achievable force is 1/σ. This is exactly the lever, or gear-ratio, principle: gearing up for speed gears down for force, and σ × (1/σ) = 1 is the statement that no transmission grants you both. </w:t>
+            </w:r>
+            <w:r>
+              <w:rPr>
+                <w:b/>
+                <w:bCs/>
+              </w:rPr>
+              <w:t xml:space="preserve">Posture is the arm’s gearbox.</w:t>
+            </w:r>
+          </w:p>
+          <w:p>
+            <w:pPr>
+              <w:spacing w:after="160" w:line="300" w:lineRule="auto"/>
+            </w:pPr>
+            <w:r>
+              <w:rPr>
+                <w:b/>
+                <w:bCs/>
+              </w:rPr>
+              <w:t xml:space="preserve">Practical corollary. </w:t>
+            </w:r>
+            <w:r>
+              <w:t xml:space="preserve">To push hard in a given direction, orient the arm so that direction lies along the </w:t>
+            </w:r>
+            <w:r>
+              <w:rPr>
+                <w:i/>
+                <w:iCs/>
+              </w:rPr>
+              <w:t xml:space="preserve">minor</w:t>
+            </w:r>
+            <w:r>
+              <w:t xml:space="preserve"> axis of the velocity ellipsoid. The limiting case is the singularity of §4.2: at θ₂ = 0° the arm is fully extended, σ₂ = 0, and radial motion is impossible — while radial force capability grows without bound, because the arm acts as a strut and the load passes through the skeleton rather than being carried by joint torque. This is why you lock your elbow to push a stalled car.</w:t>
+            </w:r>
+          </w:p>
+          <w:p>
+            <w:pPr>
+              <w:spacing w:after="0" w:line="300" w:lineRule="auto"/>
+            </w:pPr>
+            <w:r>
+              <w:rPr>
+                <w:b/>
+                <w:bCs/>
+              </w:rPr>
+              <w:t xml:space="preserve">(c)  No — and this is a common misreading of w. </w:t>
+            </w:r>
+            <w:r>
+              <w:t xml:space="preserve">Yoshikawa’s measure is the </w:t>
+            </w:r>
+            <w:r>
+              <w:rPr>
+                <w:i/>
+                <w:iCs/>
+              </w:rPr>
+              <w:t xml:space="preserve">product</w:t>
+            </w:r>
+            <w:r>
+              <w:t xml:space="preserve"> of the semi-axes (w = σ₁σ₂ = |det J|), so it tracks the ellipsoid’s area, not its roundness. At θ₂ = 90° our arm has σ = (0.699, 0.224) m: the area is maximal, w = l₁l₂ = 0.156, yet the ellipsoid is still elongated more than 3:1. The hand is over three times faster along one direction than the other — and, by the reciprocal relation, over three times weaker along that same direction. Uniformity is a different criterion, measured by the condition number σ₁/σ₂, and for our link lengths it is best near θ₂ ≈ 125° (ratio 2.39), where w has fallen to 0.127. </w:t>
+            </w:r>
+            <w:r>
+              <w:rPr>
+                <w:b/>
+                <w:bCs/>
+              </w:rPr>
+              <w:t xml:space="preserve">Maximum manipulability and maximum uniformity are different postures</w:t>
+            </w:r>
+            <w:r>
+              <w:t xml:space="preserve"> — worth remembering whenever it is claimed that the motor system ‘optimises manipulability’.</w:t>
+            </w:r>
+          </w:p>
+        </w:tc>
+      </w:tr>
+    </w:tbl>
+    <w:p>
+      <w:pPr>
+        <w:spacing w:after="0"/>
+      </w:pPr>
+    </w:p>
+    <w:p>
+      <w:r>
+        <w:br w:type="page"/>
+      </w:r>
+    </w:p>
+    <w:p>
+      <w:pPr>
+        <w:pStyle w:val="Heading1"/>
+        <w:spacing w:before="0"/>
+      </w:pPr>
+      <w:r>
+        <w:lastRenderedPageBreak/>
+        <w:t>6. Kinematic Redundancy &amp; the Degrees of Freedom Problem</w:t>
+      </w:r>
+    </w:p>
+    <w:tbl>
+      <w:tblPr>
+        <w:tblW w:w="9360" w:type="dxa"/>
+        <w:tblLayout w:type="fixed"/>
+        <w:tblCellMar>
+          <w:top w:w="120" w:type="dxa"/>
+          <w:left w:w="200" w:type="dxa"/>
+          <w:bottom w:w="120" w:type="dxa"/>
+          <w:right w:w="200" w:type="dxa"/>
+        </w:tblCellMar>
+        <w:tblLook w:val="0000" w:firstRow="0" w:lastRow="0" w:firstColumn="0" w:lastColumn="0" w:noHBand="0" w:noVBand="0"/>
+      </w:tblPr>
+      <w:tblGrid>
+        <w:gridCol w:w="9360"/>
+      </w:tblGrid>
+      <w:tr>
+        <w:tc>
+          <w:tcPr>
+            <w:tcW w:w="9360" w:type="dxa"/>
+            <w:tcBorders>
+              <w:top w:val="single" w:sz="2" w:space="0" w:color="2E86AB"/>
+              <w:left w:val="single" w:sz="2" w:space="0" w:color="2E86AB"/>
+              <w:bottom w:val="single" w:sz="2" w:space="0" w:color="2E86AB"/>
+              <w:right w:val="single" w:sz="2" w:space="0" w:color="2E86AB"/>
+            </w:tcBorders>
+            <w:shd w:val="clear" w:color="auto" w:fill="E8F1F8"/>
+          </w:tcPr>
+          <w:p>
+            <w:pPr>
+              <w:spacing w:after="80"/>
+            </w:pPr>
+            <w:r>
+              <w:rPr>
+                <w:rFonts w:ascii="Georgia" w:eastAsia="Georgia" w:hAnsi="Georgia" w:cs="Georgia"/>
+                <w:b/>
+                <w:bCs/>
+                <w:color w:val="2E86AB"/>
+              </w:rPr>
+              <w:t>A Note on Scope</w:t>
+            </w:r>
+          </w:p>
+          <w:p>
+            <w:pPr>
+              <w:spacing w:after="160" w:line="300" w:lineRule="auto"/>
+            </w:pPr>
+            <w:r>
               <w:t xml:space="preserve">This section is included for pedagogical context. Our 2-DOF arm operating in a 2D task space is </w:t>
             </w:r>
             <w:r>
@@ -6055,15 +4671,7 @@
               <w:t>not</w:t>
             </w:r>
             <w:r>
-              <w:t xml:space="preserve"> redundant—it has exactly as many degrees of freedom as task dimensions, so each reachable target has a finite number of IK solutions (typically one, given our joint limits). You will never encounter null spaces, pseudoinverses, or infinite solution sets in the labs. However, kinematic redundancy is one of the central problems in motor control </w:t>
-            </w:r>
-            <w:proofErr w:type="gramStart"/>
-            <w:r>
-              <w:t>theory, and</w:t>
-            </w:r>
-            <w:proofErr w:type="gramEnd"/>
-            <w:r>
-              <w:t xml:space="preserve"> understanding it is essential for reading the literature. The concepts introduced here—Bernstein’s problem, cost-function resolution, the Uncontrolled Manifold Hypothesis—will help you appreciate the theoretical significance of the controllers we build in Modules 2–4, even though our simplified model sidesteps the redundancy problem itself.</w:t>
+              <w:t xml:space="preserve"> redundant—it has exactly as many degrees of freedom as task dimensions, so each reachable target has a finite number of IK solutions (typically one, given our joint limits). You will never encounter null spaces, pseudoinverses, or infinite solution sets in the labs. However, kinematic redundancy is one of the central problems in motor control theory, and understanding it is essential for reading the literature. The concepts introduced here—Bernstein’s problem, cost-function resolution, the Uncontrolled Manifold Hypothesis—will help you appreciate the theoretical significance of the controllers we build in Modules 2–4, even though our simplified model sidesteps the redundancy problem itself.</w:t>
             </w:r>
           </w:p>
         </w:tc>
@@ -6104,13 +4712,8 @@
           <w:bottom w:val="single" w:sz="2" w:space="4" w:color="2E86AB"/>
         </w:pBdr>
       </w:pPr>
-      <w:proofErr w:type="gramStart"/>
-      <w:r>
-        <w:t>6.1  The</w:t>
-      </w:r>
-      <w:proofErr w:type="gramEnd"/>
-      <w:r>
-        <w:t xml:space="preserve"> Ill-Posed Problem</w:t>
+      <w:r>
+        <w:t xml:space="preserve">6.1  The Ill-Posed Problem</w:t>
       </w:r>
     </w:p>
     <w:p>
@@ -6177,27 +4780,7 @@
           <w:sz w:val="24"/>
           <w:szCs w:val="24"/>
         </w:rPr>
-        <w:t>null(J) = {</w:t>
-      </w:r>
-      <w:proofErr w:type="gramStart"/>
-      <w:r>
-        <w:rPr>
-          <w:rFonts w:ascii="Cambria Math" w:eastAsia="Cambria Math" w:hAnsi="Cambria Math" w:cs="Cambria Math"/>
-          <w:color w:val="1B2A4A"/>
-          <w:sz w:val="24"/>
-          <w:szCs w:val="24"/>
-        </w:rPr>
-        <w:t>θ̇ :</w:t>
-      </w:r>
-      <w:proofErr w:type="gramEnd"/>
-      <w:r>
-        <w:rPr>
-          <w:rFonts w:ascii="Cambria Math" w:eastAsia="Cambria Math" w:hAnsi="Cambria Math" w:cs="Cambria Math"/>
-          <w:color w:val="1B2A4A"/>
-          <w:sz w:val="24"/>
-          <w:szCs w:val="24"/>
-        </w:rPr>
-        <w:t xml:space="preserve"> J</w:t>
+        <w:t xml:space="preserve">null(J) = {θ̇ : J</w:t>
       </w:r>
       <m:oMath>
         <m:acc>
@@ -6233,19 +4816,8 @@
           <w:sz w:val="24"/>
           <w:szCs w:val="24"/>
         </w:rPr>
-        <w:t xml:space="preserve">= </w:t>
-      </w:r>
-      <w:proofErr w:type="gramStart"/>
-      <w:r>
-        <w:rPr>
-          <w:rFonts w:ascii="Cambria Math" w:eastAsia="Cambria Math" w:hAnsi="Cambria Math" w:cs="Cambria Math"/>
-          <w:color w:val="1B2A4A"/>
-          <w:sz w:val="24"/>
-          <w:szCs w:val="24"/>
-        </w:rPr>
-        <w:t>0 }</w:t>
-      </w:r>
-      <w:proofErr w:type="gramEnd"/>
+        <w:t xml:space="preserve">= 0 }</w:t>
+      </w:r>
       <w:r>
         <w:rPr>
           <w:color w:val="666666"/>
@@ -6279,7 +4851,7 @@
         <w:spacing w:after="160" w:line="300" w:lineRule="auto"/>
       </w:pPr>
       <w:r>
-        <w:t>Figure 9 makes this concrete under our joint limits: the 2-DOF arm’s two IK solutions collapse to a single valid posture once hyperextension is excluded, while a redundant 3-DOF arm still reaches the same target through a continuous but bounded family of postures.</w:t>
+        <w:t>Figure 10 makes this concrete under our joint limits: the 2-DOF arm’s two IK solutions collapse to a single valid posture once hyperextension is excluded, while a redundant 3-DOF arm still reaches the same target through a continuous but bounded family of postures.</w:t>
       </w:r>
     </w:p>
     <w:p>
@@ -6296,7 +4868,7 @@
           <wp:inline distT="0" distB="0" distL="0" distR="0" wp14:anchorId="629716DD" wp14:editId="595508A1">
             <wp:extent cx="5334000" cy="2332355"/>
             <wp:effectExtent l="0" t="0" r="0" b="0"/>
-            <wp:docPr id="8" name="Figure 9. Kinematic redundancy under anatomical joint limits." descr="Figure 9. Kinematic redundancy under anatomical joint limits."/>
+            <wp:docPr id="8" name="Figure 10. Kinematic redundancy under anatomical joint limits." descr="Figure 10. Kinematic redundancy under anatomical joint limits."/>
             <wp:cNvGraphicFramePr>
               <a:graphicFrameLocks xmlns:a="http://schemas.openxmlformats.org/drawingml/2006/main" noChangeAspect="1"/>
             </wp:cNvGraphicFramePr>
@@ -6304,7 +4876,7 @@
               <a:graphicData uri="http://schemas.openxmlformats.org/drawingml/2006/picture">
                 <pic:pic xmlns:pic="http://schemas.openxmlformats.org/drawingml/2006/picture">
                   <pic:nvPicPr>
-                    <pic:cNvPr id="8" name="Figure 9. Kinematic redundancy under anatomical joint limits." descr="Figure 9. Kinematic redundancy under anatomical joint limits."/>
+                    <pic:cNvPr id="8" name="Figure 10. Kinematic redundancy under anatomical joint limits." descr="Figure 10. Kinematic redundancy under anatomical joint limits."/>
                     <pic:cNvPicPr>
                       <a:picLocks noChangeAspect="1" noChangeArrowheads="1"/>
                     </pic:cNvPicPr>
@@ -6344,7 +4916,7 @@
           <w:sz w:val="20"/>
           <w:szCs w:val="20"/>
         </w:rPr>
-        <w:t>Figure 9. Kinematic redundancy under anatomical joint limits. Left: our non-redundant 2-DOF arm — the elbow-up solution (blue) is the only valid posture, while the elbow-down solution (grey, dashed) requires hyperextension (θ₂ &lt; 0) and is rejected by the joint limits. Right: a redundant 3-DOF arm subject to the same limits reaches the same target through a continuous but bounded family of postures (self-motion through the null space of J). Redundancy persists under constraints; our 2-link model simply never has it.</w:t>
+        <w:t>Figure 10. Kinematic redundancy under anatomical joint limits. Left: our non-redundant 2-DOF arm — the elbow-up solution (blue) is the only valid posture, while the elbow-down solution (grey, dashed) requires hyperextension (θ₂ &lt; 0) and is rejected by the joint limits. Right: a redundant 3-DOF arm subject to the same limits reaches the same target through a continuous but bounded family of postures (self-motion through the null space of J). Redundancy persists under constraints; our 2-link model simply never has it.</w:t>
       </w:r>
     </w:p>
     <w:p>
@@ -6354,13 +4926,8 @@
           <w:bottom w:val="single" w:sz="2" w:space="4" w:color="2E86AB"/>
         </w:pBdr>
       </w:pPr>
-      <w:proofErr w:type="gramStart"/>
-      <w:r>
-        <w:t>6.2  Resolution</w:t>
-      </w:r>
-      <w:proofErr w:type="gramEnd"/>
-      <w:r>
-        <w:t xml:space="preserve"> Strategies</w:t>
+      <w:r>
+        <w:t xml:space="preserve">6.2  Resolution Strategies</w:t>
       </w:r>
     </w:p>
     <w:p>
@@ -6388,23 +4955,7 @@
         <w:t xml:space="preserve">Pseudoinverse solution: </w:t>
       </w:r>
       <w:r>
-        <w:t xml:space="preserve">Choose the joint velocities with minimum norm: θ̇ = </w:t>
-      </w:r>
-      <w:proofErr w:type="spellStart"/>
-      <w:r>
-        <w:t>J⁺ṗ</w:t>
-      </w:r>
-      <w:proofErr w:type="spellEnd"/>
-      <w:r>
-        <w:t xml:space="preserve">, where J⁺ = </w:t>
-      </w:r>
-      <w:proofErr w:type="gramStart"/>
-      <w:r>
-        <w:t>Jᵀ(</w:t>
-      </w:r>
-      <w:proofErr w:type="gramEnd"/>
-      <w:r>
-        <w:t>JJᵀ)⁻¹ is the Moore–Penrose pseudoinverse. This minimizes instantaneous joint speed but has no physiological justification.</w:t>
+        <w:t xml:space="preserve">Choose the joint velocities with minimum norm: θ̇ = J⁺ṗ, where J⁺ = Jᵀ(JJᵀ)⁻¹ is the Moore–Penrose pseudoinverse. This minimizes instantaneous joint speed but has no physiological justification.</w:t>
       </w:r>
     </w:p>
     <w:p>
@@ -6464,15 +5015,7 @@
         <w:t xml:space="preserve">Uncontrolled Manifold Hypothesis: </w:t>
       </w:r>
       <w:r>
-        <w:t xml:space="preserve">Scholz &amp; </w:t>
-      </w:r>
-      <w:proofErr w:type="spellStart"/>
-      <w:r>
-        <w:t>Schöner</w:t>
-      </w:r>
-      <w:proofErr w:type="spellEnd"/>
-      <w:r>
-        <w:t xml:space="preserve"> (1999) proposed that the brain does not resolve redundancy at all. Instead, it only stabilizes task-relevant combinations of DOFs, allowing variability to accumulate freely in the null space.</w:t>
+        <w:t xml:space="preserve">Scholz &amp; Schöner (1999) proposed that the brain does not resolve redundancy at all. Instead, it only stabilizes task-relevant combinations of DOFs, allowing variability to accumulate freely in the null space.</w:t>
       </w:r>
     </w:p>
     <w:p>
@@ -6482,13 +5025,8 @@
           <w:bottom w:val="single" w:sz="2" w:space="4" w:color="2E86AB"/>
         </w:pBdr>
       </w:pPr>
-      <w:proofErr w:type="gramStart"/>
-      <w:r>
-        <w:t>6.3  Preview</w:t>
-      </w:r>
-      <w:proofErr w:type="gramEnd"/>
-      <w:r>
-        <w:t>: Why This Matters</w:t>
+      <w:r>
+        <w:t>6.3  Preview: Why This Matters</w:t>
       </w:r>
     </w:p>
     <w:p>
@@ -6728,97 +5266,7 @@
                 <w:sz w:val="20"/>
                 <w:szCs w:val="20"/>
               </w:rPr>
-              <w:t xml:space="preserve">x = </w:t>
-            </w:r>
-            <w:proofErr w:type="spellStart"/>
-            <w:r>
-              <w:rPr>
-                <w:rFonts w:ascii="Cambria Math" w:eastAsia="Cambria Math" w:hAnsi="Cambria Math" w:cs="Cambria Math"/>
-                <w:sz w:val="20"/>
-                <w:szCs w:val="20"/>
-              </w:rPr>
-              <w:t>l₁cosθ</w:t>
-            </w:r>
-            <w:proofErr w:type="spellEnd"/>
-            <w:r>
-              <w:rPr>
-                <w:rFonts w:ascii="Cambria Math" w:eastAsia="Cambria Math" w:hAnsi="Cambria Math" w:cs="Cambria Math"/>
-                <w:sz w:val="20"/>
-                <w:szCs w:val="20"/>
-              </w:rPr>
-              <w:t xml:space="preserve">₁ + </w:t>
-            </w:r>
-            <w:proofErr w:type="spellStart"/>
-            <w:r>
-              <w:rPr>
-                <w:rFonts w:ascii="Cambria Math" w:eastAsia="Cambria Math" w:hAnsi="Cambria Math" w:cs="Cambria Math"/>
-                <w:sz w:val="20"/>
-                <w:szCs w:val="20"/>
-              </w:rPr>
-              <w:t>l₂cos</w:t>
-            </w:r>
-            <w:proofErr w:type="spellEnd"/>
-            <w:r>
-              <w:rPr>
-                <w:rFonts w:ascii="Cambria Math" w:eastAsia="Cambria Math" w:hAnsi="Cambria Math" w:cs="Cambria Math"/>
-                <w:sz w:val="20"/>
-                <w:szCs w:val="20"/>
-              </w:rPr>
-              <w:t>(θ₁+θ₂</w:t>
-            </w:r>
-            <w:proofErr w:type="gramStart"/>
-            <w:r>
-              <w:rPr>
-                <w:rFonts w:ascii="Cambria Math" w:eastAsia="Cambria Math" w:hAnsi="Cambria Math" w:cs="Cambria Math"/>
-                <w:sz w:val="20"/>
-                <w:szCs w:val="20"/>
-              </w:rPr>
-              <w:t>),  y</w:t>
-            </w:r>
-            <w:proofErr w:type="gramEnd"/>
-            <w:r>
-              <w:rPr>
-                <w:rFonts w:ascii="Cambria Math" w:eastAsia="Cambria Math" w:hAnsi="Cambria Math" w:cs="Cambria Math"/>
-                <w:sz w:val="20"/>
-                <w:szCs w:val="20"/>
-              </w:rPr>
-              <w:t xml:space="preserve"> = </w:t>
-            </w:r>
-            <w:proofErr w:type="spellStart"/>
-            <w:r>
-              <w:rPr>
-                <w:rFonts w:ascii="Cambria Math" w:eastAsia="Cambria Math" w:hAnsi="Cambria Math" w:cs="Cambria Math"/>
-                <w:sz w:val="20"/>
-                <w:szCs w:val="20"/>
-              </w:rPr>
-              <w:t>l₁sinθ</w:t>
-            </w:r>
-            <w:proofErr w:type="spellEnd"/>
-            <w:r>
-              <w:rPr>
-                <w:rFonts w:ascii="Cambria Math" w:eastAsia="Cambria Math" w:hAnsi="Cambria Math" w:cs="Cambria Math"/>
-                <w:sz w:val="20"/>
-                <w:szCs w:val="20"/>
-              </w:rPr>
-              <w:t xml:space="preserve">₁ + </w:t>
-            </w:r>
-            <w:proofErr w:type="spellStart"/>
-            <w:r>
-              <w:rPr>
-                <w:rFonts w:ascii="Cambria Math" w:eastAsia="Cambria Math" w:hAnsi="Cambria Math" w:cs="Cambria Math"/>
-                <w:sz w:val="20"/>
-                <w:szCs w:val="20"/>
-              </w:rPr>
-              <w:t>l₂sin</w:t>
-            </w:r>
-            <w:proofErr w:type="spellEnd"/>
-            <w:r>
-              <w:rPr>
-                <w:rFonts w:ascii="Cambria Math" w:eastAsia="Cambria Math" w:hAnsi="Cambria Math" w:cs="Cambria Math"/>
-                <w:sz w:val="20"/>
-                <w:szCs w:val="20"/>
-              </w:rPr>
-              <w:t>(θ₁+θ₂)</w:t>
+              <w:t xml:space="preserve">x = l₁cosθ₁ + l₂cos(θ₁+θ₂),  y = l₁sinθ₁ + l₂sin(θ₁+θ₂)</w:t>
             </w:r>
           </w:p>
         </w:tc>
@@ -6863,25 +5311,7 @@
                 <w:sz w:val="20"/>
                 <w:szCs w:val="20"/>
               </w:rPr>
-              <w:t>θ₂ = ±</w:t>
-            </w:r>
-            <w:proofErr w:type="spellStart"/>
-            <w:r>
-              <w:rPr>
-                <w:rFonts w:ascii="Cambria Math" w:eastAsia="Cambria Math" w:hAnsi="Cambria Math" w:cs="Cambria Math"/>
-                <w:sz w:val="20"/>
-                <w:szCs w:val="20"/>
-              </w:rPr>
-              <w:t>arccos</w:t>
-            </w:r>
-            <w:proofErr w:type="spellEnd"/>
-            <w:r>
-              <w:rPr>
-                <w:rFonts w:ascii="Cambria Math" w:eastAsia="Cambria Math" w:hAnsi="Cambria Math" w:cs="Cambria Math"/>
-                <w:sz w:val="20"/>
-                <w:szCs w:val="20"/>
-              </w:rPr>
-              <w:t>[(x²+y²−l₁²−l₂²) / (2l₁l₂)]</w:t>
+              <w:t>θ₂ = ±arccos[(x²+y²−l₁²−l₂²) / (2l₁l₂)]</w:t>
             </w:r>
           </w:p>
         </w:tc>
@@ -6928,27 +5358,7 @@
                 <w:sz w:val="20"/>
                 <w:szCs w:val="20"/>
               </w:rPr>
-              <w:t>θ₁ = atan2(</w:t>
-            </w:r>
-            <w:proofErr w:type="spellStart"/>
-            <w:proofErr w:type="gramStart"/>
-            <w:r>
-              <w:rPr>
-                <w:rFonts w:ascii="Cambria Math" w:eastAsia="Cambria Math" w:hAnsi="Cambria Math" w:cs="Cambria Math"/>
-                <w:sz w:val="20"/>
-                <w:szCs w:val="20"/>
-              </w:rPr>
-              <w:t>y,x</w:t>
-            </w:r>
-            <w:proofErr w:type="spellEnd"/>
-            <w:proofErr w:type="gramEnd"/>
-            <w:r>
-              <w:rPr>
-                <w:rFonts w:ascii="Cambria Math" w:eastAsia="Cambria Math" w:hAnsi="Cambria Math" w:cs="Cambria Math"/>
-                <w:sz w:val="20"/>
-                <w:szCs w:val="20"/>
-              </w:rPr>
-              <w:t>) − atan2(k₂, k₁)</w:t>
+              <w:t>θ₁ = atan2(y,x) − atan2(k₂, k₁)</w:t>
             </w:r>
           </w:p>
         </w:tc>
@@ -6993,25 +5403,7 @@
                 <w:sz w:val="20"/>
                 <w:szCs w:val="20"/>
               </w:rPr>
-              <w:t xml:space="preserve">det(J) = </w:t>
-            </w:r>
-            <w:proofErr w:type="spellStart"/>
-            <w:r>
-              <w:rPr>
-                <w:rFonts w:ascii="Cambria Math" w:eastAsia="Cambria Math" w:hAnsi="Cambria Math" w:cs="Cambria Math"/>
-                <w:sz w:val="20"/>
-                <w:szCs w:val="20"/>
-              </w:rPr>
-              <w:t>l₁l</w:t>
-            </w:r>
-            <w:proofErr w:type="spellEnd"/>
-            <w:r>
-              <w:rPr>
-                <w:rFonts w:ascii="Cambria Math" w:eastAsia="Cambria Math" w:hAnsi="Cambria Math" w:cs="Cambria Math"/>
-                <w:sz w:val="20"/>
-                <w:szCs w:val="20"/>
-              </w:rPr>
-              <w:t>₂ sin(θ₂)</w:t>
+              <w:t xml:space="preserve">det(J) = l₁l₂ sin(θ₂)</w:t>
             </w:r>
           </w:p>
         </w:tc>
@@ -7103,43 +5495,7 @@
                 <w:sz w:val="20"/>
                 <w:szCs w:val="20"/>
               </w:rPr>
-              <w:t>w = |</w:t>
-            </w:r>
-            <w:proofErr w:type="spellStart"/>
-            <w:r>
-              <w:rPr>
-                <w:rFonts w:ascii="Cambria Math" w:eastAsia="Cambria Math" w:hAnsi="Cambria Math" w:cs="Cambria Math"/>
-                <w:sz w:val="20"/>
-                <w:szCs w:val="20"/>
-              </w:rPr>
-              <w:t>l₁l</w:t>
-            </w:r>
-            <w:proofErr w:type="spellEnd"/>
-            <w:r>
-              <w:rPr>
-                <w:rFonts w:ascii="Cambria Math" w:eastAsia="Cambria Math" w:hAnsi="Cambria Math" w:cs="Cambria Math"/>
-                <w:sz w:val="20"/>
-                <w:szCs w:val="20"/>
-              </w:rPr>
-              <w:t>₂ sin(θ</w:t>
-            </w:r>
-            <w:proofErr w:type="gramStart"/>
-            <w:r>
-              <w:rPr>
-                <w:rFonts w:ascii="Cambria Math" w:eastAsia="Cambria Math" w:hAnsi="Cambria Math" w:cs="Cambria Math"/>
-                <w:sz w:val="20"/>
-                <w:szCs w:val="20"/>
-              </w:rPr>
-              <w:t>₂)|,  max</w:t>
-            </w:r>
-            <w:proofErr w:type="gramEnd"/>
-            <w:r>
-              <w:rPr>
-                <w:rFonts w:ascii="Cambria Math" w:eastAsia="Cambria Math" w:hAnsi="Cambria Math" w:cs="Cambria Math"/>
-                <w:sz w:val="20"/>
-                <w:szCs w:val="20"/>
-              </w:rPr>
-              <w:t xml:space="preserve"> at θ₂ = 90°</w:t>
+              <w:t xml:space="preserve">w = |l₁l₂ sin(θ₂)|,  max at θ₂ = 90°</w:t>
             </w:r>
           </w:p>
         </w:tc>

</xml_diff>